<commit_message>
Relleno de 2.1 Matias Rosales
</commit_message>
<xml_diff>
--- a/Fase 2/Evidencia Individuales/Rosales_Matias_2.1_APT122_DiarioReflexionFase2.docx
+++ b/Fase 2/Evidencia Individuales/Rosales_Matias_2.1_APT122_DiarioReflexionFase2.docx
@@ -1,6 +1,6 @@
 
 <file path=word/document.xml><?xml version="1.0" encoding="utf-8"?>
-<w:document xmlns:wpc="http://schemas.microsoft.com/office/word/2010/wordprocessingCanvas" xmlns:cx="http://schemas.microsoft.com/office/drawing/2014/chartex" xmlns:mc="http://schemas.openxmlformats.org/markup-compatibility/2006" xmlns:o="urn:schemas-microsoft-com:office:office" xmlns:r="http://schemas.openxmlformats.org/officeDocument/2006/relationships" xmlns:m="http://schemas.openxmlformats.org/officeDocument/2006/math" xmlns:v="urn:schemas-microsoft-com:vml" xmlns:wp14="http://schemas.microsoft.com/office/word/2010/wordprocessingDrawing" xmlns:wp="http://schemas.openxmlformats.org/drawingml/2006/wordprocessingDrawing" xmlns:w10="urn:schemas-microsoft-com:office:word" xmlns:w="http://schemas.openxmlformats.org/wordprocessingml/2006/main" xmlns:w14="http://schemas.microsoft.com/office/word/2010/wordml" xmlns:w15="http://schemas.microsoft.com/office/word/2012/wordml" xmlns:w16se="http://schemas.microsoft.com/office/word/2015/wordml/symex" xmlns:wpg="http://schemas.microsoft.com/office/word/2010/wordprocessingGroup" xmlns:wpi="http://schemas.microsoft.com/office/word/2010/wordprocessingInk" xmlns:wne="http://schemas.microsoft.com/office/word/2006/wordml" xmlns:wps="http://schemas.microsoft.com/office/word/2010/wordprocessingShape" mc:Ignorable="w14 w15 w16se wp14">
+<w:document xmlns:wpc="http://schemas.microsoft.com/office/word/2010/wordprocessingCanvas" xmlns:cx="http://schemas.microsoft.com/office/drawing/2014/chartex" xmlns:cx1="http://schemas.microsoft.com/office/drawing/2015/9/8/chartex" xmlns:cx2="http://schemas.microsoft.com/office/drawing/2015/10/21/chartex" xmlns:cx3="http://schemas.microsoft.com/office/drawing/2016/5/9/chartex" xmlns:cx4="http://schemas.microsoft.com/office/drawing/2016/5/10/chartex" xmlns:cx5="http://schemas.microsoft.com/office/drawing/2016/5/11/chartex" xmlns:cx6="http://schemas.microsoft.com/office/drawing/2016/5/12/chartex" xmlns:cx7="http://schemas.microsoft.com/office/drawing/2016/5/13/chartex" xmlns:cx8="http://schemas.microsoft.com/office/drawing/2016/5/14/chartex" xmlns:mc="http://schemas.openxmlformats.org/markup-compatibility/2006" xmlns:aink="http://schemas.microsoft.com/office/drawing/2016/ink" xmlns:am3d="http://schemas.microsoft.com/office/drawing/2017/model3d" xmlns:o="urn:schemas-microsoft-com:office:office" xmlns:oel="http://schemas.microsoft.com/office/2019/extlst" xmlns:r="http://schemas.openxmlformats.org/officeDocument/2006/relationships" xmlns:m="http://schemas.openxmlformats.org/officeDocument/2006/math" xmlns:v="urn:schemas-microsoft-com:vml" xmlns:wp14="http://schemas.microsoft.com/office/word/2010/wordprocessingDrawing" xmlns:wp="http://schemas.openxmlformats.org/drawingml/2006/wordprocessingDrawing" xmlns:w10="urn:schemas-microsoft-com:office:word" xmlns:w="http://schemas.openxmlformats.org/wordprocessingml/2006/main" xmlns:w14="http://schemas.microsoft.com/office/word/2010/wordml" xmlns:w15="http://schemas.microsoft.com/office/word/2012/wordml" xmlns:w16cex="http://schemas.microsoft.com/office/word/2018/wordml/cex" xmlns:w16cid="http://schemas.microsoft.com/office/word/2016/wordml/cid" xmlns:w16="http://schemas.microsoft.com/office/word/2018/wordml" xmlns:w16du="http://schemas.microsoft.com/office/word/2023/wordml/word16du" xmlns:w16sdtdh="http://schemas.microsoft.com/office/word/2020/wordml/sdtdatahash" xmlns:w16sdtfl="http://schemas.microsoft.com/office/word/2024/wordml/sdtformatlock" xmlns:w16se="http://schemas.microsoft.com/office/word/2015/wordml/symex" xmlns:wpg="http://schemas.microsoft.com/office/word/2010/wordprocessingGroup" xmlns:wpi="http://schemas.microsoft.com/office/word/2010/wordprocessingInk" xmlns:wne="http://schemas.microsoft.com/office/word/2006/wordml" xmlns:wps="http://schemas.microsoft.com/office/word/2010/wordprocessingShape" mc:Ignorable="w14 w15 w16se w16cid w16 w16cex w16sdtdh w16sdtfl w16du wp14">
   <w:body>
     <w:p/>
     <w:tbl>
@@ -286,7 +286,25 @@
                 <w:sz w:val="24"/>
                 <w:szCs w:val="24"/>
               </w:rPr>
-              <w:t>1. Mira tu carta Gantt y reflexiona sobre los avances de tu Proyecto APT</w:t>
+              <w:t xml:space="preserve">1. Mira </w:t>
+            </w:r>
+            <w:proofErr w:type="spellStart"/>
+            <w:r>
+              <w:rPr>
+                <w:rFonts w:eastAsiaTheme="majorEastAsia"/>
+                <w:sz w:val="24"/>
+                <w:szCs w:val="24"/>
+              </w:rPr>
+              <w:t>tu</w:t>
+            </w:r>
+            <w:proofErr w:type="spellEnd"/>
+            <w:r>
+              <w:rPr>
+                <w:rFonts w:eastAsiaTheme="majorEastAsia"/>
+                <w:sz w:val="24"/>
+                <w:szCs w:val="24"/>
+              </w:rPr>
+              <w:t xml:space="preserve"> carta Gantt y reflexiona sobre los avances de tu Proyecto APT</w:t>
             </w:r>
           </w:p>
         </w:tc>
@@ -306,7 +324,6 @@
               <w:jc w:val="both"/>
               <w:rPr>
                 <w:rFonts w:eastAsiaTheme="majorEastAsia"/>
-                <w:color w:val="767171" w:themeColor="background2" w:themeShade="80"/>
                 <w:sz w:val="24"/>
                 <w:szCs w:val="24"/>
               </w:rPr>
@@ -318,6 +335,70 @@
                 <w:szCs w:val="24"/>
               </w:rPr>
               <w:t>¿Has podido cumplir todas las actividades en los tiempos definidos? ¿Qué factores han facilitado o dificultado el desarrollo de las actividades de tu plan de trabajo?</w:t>
+            </w:r>
+          </w:p>
+          <w:p>
+            <w:pPr>
+              <w:jc w:val="both"/>
+              <w:rPr>
+                <w:rFonts w:eastAsiaTheme="majorEastAsia"/>
+                <w:sz w:val="24"/>
+                <w:szCs w:val="24"/>
+              </w:rPr>
+            </w:pPr>
+          </w:p>
+          <w:p>
+            <w:pPr>
+              <w:jc w:val="both"/>
+              <w:rPr>
+                <w:rFonts w:eastAsiaTheme="majorEastAsia"/>
+                <w:sz w:val="24"/>
+                <w:szCs w:val="24"/>
+              </w:rPr>
+            </w:pPr>
+            <w:r>
+              <w:rPr>
+                <w:rFonts w:eastAsiaTheme="majorEastAsia"/>
+                <w:sz w:val="24"/>
+                <w:szCs w:val="24"/>
+              </w:rPr>
+              <w:t xml:space="preserve">Debido a las correcciones de la carta Gantt nos atrasamos dos semanas, pero hemos podidos ponernos al día. Yo creo que el </w:t>
+            </w:r>
+            <w:proofErr w:type="spellStart"/>
+            <w:r>
+              <w:rPr>
+                <w:rFonts w:eastAsiaTheme="majorEastAsia"/>
+                <w:sz w:val="24"/>
+                <w:szCs w:val="24"/>
+              </w:rPr>
+              <w:t>daily</w:t>
+            </w:r>
+            <w:proofErr w:type="spellEnd"/>
+            <w:r>
+              <w:rPr>
+                <w:rFonts w:eastAsiaTheme="majorEastAsia"/>
+                <w:sz w:val="24"/>
+                <w:szCs w:val="24"/>
+              </w:rPr>
+              <w:t xml:space="preserve"> </w:t>
+            </w:r>
+            <w:proofErr w:type="gramStart"/>
+            <w:r>
+              <w:rPr>
+                <w:rFonts w:eastAsiaTheme="majorEastAsia"/>
+                <w:sz w:val="24"/>
+                <w:szCs w:val="24"/>
+              </w:rPr>
+              <w:t>meeting</w:t>
+            </w:r>
+            <w:proofErr w:type="gramEnd"/>
+            <w:r>
+              <w:rPr>
+                <w:rFonts w:eastAsiaTheme="majorEastAsia"/>
+                <w:sz w:val="24"/>
+                <w:szCs w:val="24"/>
+              </w:rPr>
+              <w:t xml:space="preserve"> a echo que estemos siempre trabajando en algo y si tenemos problemas es más fácil comunicarlos en llamada que por texto haciendo que el avance no se estanque por varios días si es que hay problemas, también el sprint planning nos a echo repartir de mejor forma las tareas. Creo haber tenido un modelo de datos difuso cuando yo me integre dificulto desarrollar ciertas historias de usuario, pero lo bueno es que se actuó rápido y no retraso el ritmo para ponerse al día con la carta Gantt.</w:t>
             </w:r>
           </w:p>
           <w:p>
@@ -466,6 +547,75 @@
                 <w:color w:val="1F4E79" w:themeColor="accent1" w:themeShade="80"/>
               </w:rPr>
             </w:pPr>
+            <w:r>
+              <w:rPr>
+                <w:rFonts w:ascii="Calibri" w:hAnsi="Calibri"/>
+                <w:b/>
+                <w:bCs/>
+                <w:color w:val="1F4E79" w:themeColor="accent1" w:themeShade="80"/>
+              </w:rPr>
+              <w:t xml:space="preserve">Hemos enfrentado las dificultades a través registrándolos en el </w:t>
+            </w:r>
+            <w:proofErr w:type="spellStart"/>
+            <w:r>
+              <w:rPr>
+                <w:rFonts w:ascii="Calibri" w:hAnsi="Calibri"/>
+                <w:b/>
+                <w:bCs/>
+                <w:color w:val="1F4E79" w:themeColor="accent1" w:themeShade="80"/>
+              </w:rPr>
+              <w:t>impediment</w:t>
+            </w:r>
+            <w:proofErr w:type="spellEnd"/>
+            <w:r>
+              <w:rPr>
+                <w:rFonts w:ascii="Calibri" w:hAnsi="Calibri"/>
+                <w:b/>
+                <w:bCs/>
+                <w:color w:val="1F4E79" w:themeColor="accent1" w:themeShade="80"/>
+              </w:rPr>
+              <w:t xml:space="preserve"> log y teniendo conversaciones por </w:t>
+            </w:r>
+            <w:proofErr w:type="spellStart"/>
+            <w:r>
+              <w:rPr>
+                <w:rFonts w:ascii="Calibri" w:hAnsi="Calibri"/>
+                <w:b/>
+                <w:bCs/>
+                <w:color w:val="1F4E79" w:themeColor="accent1" w:themeShade="80"/>
+              </w:rPr>
+              <w:t>daily</w:t>
+            </w:r>
+            <w:proofErr w:type="spellEnd"/>
+            <w:r>
+              <w:rPr>
+                <w:rFonts w:ascii="Calibri" w:hAnsi="Calibri"/>
+                <w:b/>
+                <w:bCs/>
+                <w:color w:val="1F4E79" w:themeColor="accent1" w:themeShade="80"/>
+              </w:rPr>
+              <w:t xml:space="preserve"> </w:t>
+            </w:r>
+            <w:proofErr w:type="spellStart"/>
+            <w:r>
+              <w:rPr>
+                <w:rFonts w:ascii="Calibri" w:hAnsi="Calibri"/>
+                <w:b/>
+                <w:bCs/>
+                <w:color w:val="1F4E79" w:themeColor="accent1" w:themeShade="80"/>
+              </w:rPr>
+              <w:t>meting</w:t>
+            </w:r>
+            <w:proofErr w:type="spellEnd"/>
+            <w:r>
+              <w:rPr>
+                <w:rFonts w:ascii="Calibri" w:hAnsi="Calibri"/>
+                <w:b/>
+                <w:bCs/>
+                <w:color w:val="1F4E79" w:themeColor="accent1" w:themeShade="80"/>
+              </w:rPr>
+              <w:t xml:space="preserve"> donde programamos tareas para corregir los errores que hemos enfrentado en caso de ser muy complicado el problema hemos creados bocetos de tareas para la semana y repartido las tareas.</w:t>
+            </w:r>
           </w:p>
           <w:p>
             <w:pPr>
@@ -685,7 +835,6 @@
                 <w:sz w:val="24"/>
                 <w:szCs w:val="24"/>
               </w:rPr>
-              <w:lastRenderedPageBreak/>
               <w:t>¿Cómo evalúas tu</w:t>
             </w:r>
             <w:r>
@@ -742,6 +891,35 @@
                 <w:color w:val="1F4E79" w:themeColor="accent1" w:themeShade="80"/>
               </w:rPr>
             </w:pPr>
+            <w:r>
+              <w:rPr>
+                <w:rFonts w:ascii="Calibri" w:hAnsi="Calibri"/>
+                <w:b/>
+                <w:bCs/>
+                <w:color w:val="1F4E79" w:themeColor="accent1" w:themeShade="80"/>
+              </w:rPr>
+              <w:t xml:space="preserve">Yo evaluaría mi trabajo de aceptable puesto creo que eh desarrollado funciones en la aplicación y documentos de evidencias en tiempos acordados, pero debido a que no eh podido asistir a todas las reuniones con el profesor semanal debido a mi cambio de grupo y problemas de las micros por tacos, siento que podría estar cometiendo errores sobre todo en las evidencias de cómo se deberían desarrollar los documentos eh intentado completar de mejor forma los documentos con documentación de mis clases anteriores pero me gustaría poder recibir más </w:t>
+            </w:r>
+            <w:proofErr w:type="spellStart"/>
+            <w:r>
+              <w:rPr>
+                <w:rFonts w:ascii="Calibri" w:hAnsi="Calibri"/>
+                <w:b/>
+                <w:bCs/>
+                <w:color w:val="1F4E79" w:themeColor="accent1" w:themeShade="80"/>
+              </w:rPr>
+              <w:t>feedback</w:t>
+            </w:r>
+            <w:proofErr w:type="spellEnd"/>
+            <w:r>
+              <w:rPr>
+                <w:rFonts w:ascii="Calibri" w:hAnsi="Calibri"/>
+                <w:b/>
+                <w:bCs/>
+                <w:color w:val="1F4E79" w:themeColor="accent1" w:themeShade="80"/>
+              </w:rPr>
+              <w:t>.</w:t>
+            </w:r>
           </w:p>
           <w:p>
             <w:pPr>
@@ -868,6 +1046,84 @@
                 <w:color w:val="1F4E79" w:themeColor="accent1" w:themeShade="80"/>
               </w:rPr>
             </w:pPr>
+            <w:r>
+              <w:rPr>
+                <w:rFonts w:ascii="Calibri" w:hAnsi="Calibri"/>
+                <w:b/>
+                <w:bCs/>
+                <w:color w:val="1F4E79" w:themeColor="accent1" w:themeShade="80"/>
+              </w:rPr>
+              <w:t xml:space="preserve">Me quedan dudas sobre todo del sprint review si ce está haciendo una correcta toma del </w:t>
+            </w:r>
+            <w:proofErr w:type="spellStart"/>
+            <w:r>
+              <w:rPr>
+                <w:rFonts w:ascii="Calibri" w:hAnsi="Calibri"/>
+                <w:b/>
+                <w:bCs/>
+                <w:color w:val="1F4E79" w:themeColor="accent1" w:themeShade="80"/>
+              </w:rPr>
+              <w:t>feedback</w:t>
+            </w:r>
+            <w:proofErr w:type="spellEnd"/>
+            <w:r>
+              <w:rPr>
+                <w:rFonts w:ascii="Calibri" w:hAnsi="Calibri"/>
+                <w:b/>
+                <w:bCs/>
+                <w:color w:val="1F4E79" w:themeColor="accent1" w:themeShade="80"/>
+              </w:rPr>
+              <w:t xml:space="preserve"> del usuario, como ya eh dicho no se si la documentación se esta haciendo bien y esto me lleva creo yo a sobreproducir información que puede que no sea tan necesaria a la hora de desarrollar la aplicación </w:t>
+            </w:r>
+            <w:proofErr w:type="spellStart"/>
+            <w:r>
+              <w:rPr>
+                <w:rFonts w:ascii="Calibri" w:hAnsi="Calibri"/>
+                <w:b/>
+                <w:bCs/>
+                <w:color w:val="1F4E79" w:themeColor="accent1" w:themeShade="80"/>
+              </w:rPr>
+              <w:t>RutaGest</w:t>
+            </w:r>
+            <w:proofErr w:type="spellEnd"/>
+            <w:r>
+              <w:rPr>
+                <w:rFonts w:ascii="Calibri" w:hAnsi="Calibri"/>
+                <w:b/>
+                <w:bCs/>
+                <w:color w:val="1F4E79" w:themeColor="accent1" w:themeShade="80"/>
+              </w:rPr>
+              <w:t xml:space="preserve"> como aumentar </w:t>
+            </w:r>
+            <w:r>
+              <w:rPr>
+                <w:rFonts w:ascii="Calibri" w:hAnsi="Calibri"/>
+                <w:b/>
+                <w:bCs/>
+                <w:color w:val="1F4E79" w:themeColor="accent1" w:themeShade="80"/>
+              </w:rPr>
+              <w:t xml:space="preserve">el detalle </w:t>
+            </w:r>
+            <w:r>
+              <w:rPr>
+                <w:rFonts w:ascii="Calibri" w:hAnsi="Calibri"/>
+                <w:b/>
+                <w:bCs/>
+                <w:color w:val="1F4E79" w:themeColor="accent1" w:themeShade="80"/>
+              </w:rPr>
+              <w:t xml:space="preserve"> de las historias de usuario por ejemplo había un CRUD como historia de usuario y decidí junto con el equipo de desarrollo dividirlo en 4 para poder especificar más los criterios de aceptación.</w:t>
+            </w:r>
+          </w:p>
+          <w:p>
+            <w:pPr>
+              <w:jc w:val="both"/>
+              <w:rPr>
+                <w:rFonts w:ascii="Calibri" w:hAnsi="Calibri"/>
+                <w:b/>
+                <w:bCs/>
+                <w:color w:val="1F4E79" w:themeColor="accent1" w:themeShade="80"/>
+              </w:rPr>
+            </w:pPr>
           </w:p>
           <w:p>
             <w:pPr>
@@ -1003,6 +1259,25 @@
               <w:jc w:val="both"/>
               <w:rPr>
                 <w:rFonts w:eastAsiaTheme="majorEastAsia"/>
+                <w:sz w:val="24"/>
+                <w:szCs w:val="24"/>
+              </w:rPr>
+            </w:pPr>
+            <w:r>
+              <w:rPr>
+                <w:rFonts w:eastAsiaTheme="majorEastAsia"/>
+                <w:sz w:val="24"/>
+                <w:szCs w:val="24"/>
+              </w:rPr>
+              <w:lastRenderedPageBreak/>
+              <w:t>¿Consideran que las actividades deben ser redistribuidas entre los miembros del grupo? ¿Hay nuevas actividades que deban ser asignadas a algún miembro del grupo?</w:t>
+            </w:r>
+          </w:p>
+          <w:p>
+            <w:pPr>
+              <w:jc w:val="both"/>
+              <w:rPr>
+                <w:rFonts w:eastAsiaTheme="majorEastAsia"/>
                 <w:color w:val="767171" w:themeColor="background2" w:themeShade="80"/>
                 <w:sz w:val="24"/>
                 <w:szCs w:val="24"/>
@@ -1014,7 +1289,23 @@
                 <w:sz w:val="24"/>
                 <w:szCs w:val="24"/>
               </w:rPr>
-              <w:t>¿Consideran que las actividades deben ser redistribuidas entre los miembros del grupo? ¿Hay nuevas actividades que deban ser asignadas a algún miembro del grupo?</w:t>
+              <w:t>De momento no considero que se deba redistribuir las tareas de los integrantes</w:t>
+            </w:r>
+            <w:r>
+              <w:rPr>
+                <w:rFonts w:eastAsiaTheme="majorEastAsia"/>
+                <w:sz w:val="24"/>
+                <w:szCs w:val="24"/>
+              </w:rPr>
+              <w:t xml:space="preserve">, </w:t>
+            </w:r>
+            <w:r>
+              <w:rPr>
+                <w:rFonts w:eastAsiaTheme="majorEastAsia"/>
+                <w:sz w:val="24"/>
+                <w:szCs w:val="24"/>
+              </w:rPr>
+              <w:t>creo que se han distribuido de manera equitativa.</w:t>
             </w:r>
           </w:p>
           <w:p>
@@ -1139,10 +1430,18 @@
                 <w:sz w:val="24"/>
                 <w:szCs w:val="24"/>
               </w:rPr>
-              <w:t>. APT  grupal</w:t>
+              <w:t xml:space="preserve">. </w:t>
             </w:r>
-            <w:bookmarkStart w:id="0" w:name="_GoBack"/>
-            <w:bookmarkEnd w:id="0"/>
+            <w:proofErr w:type="gramStart"/>
+            <w:r>
+              <w:rPr>
+                <w:rFonts w:eastAsiaTheme="majorEastAsia"/>
+                <w:sz w:val="24"/>
+                <w:szCs w:val="24"/>
+              </w:rPr>
+              <w:t>APT  grupal</w:t>
+            </w:r>
+            <w:proofErr w:type="gramEnd"/>
           </w:p>
         </w:tc>
       </w:tr>
@@ -1161,7 +1460,6 @@
               <w:jc w:val="both"/>
               <w:rPr>
                 <w:rFonts w:eastAsiaTheme="majorEastAsia"/>
-                <w:color w:val="767171" w:themeColor="background2" w:themeShade="80"/>
                 <w:sz w:val="24"/>
                 <w:szCs w:val="24"/>
               </w:rPr>
@@ -1173,6 +1471,48 @@
                 <w:szCs w:val="24"/>
               </w:rPr>
               <w:t>¿Cómo evalúan el trabajo en grupo? ¿Qué aspectos positivos destacan? ¿Qué aspectos podrían mejorar?</w:t>
+            </w:r>
+          </w:p>
+          <w:p>
+            <w:pPr>
+              <w:jc w:val="both"/>
+              <w:rPr>
+                <w:rFonts w:eastAsiaTheme="majorEastAsia"/>
+                <w:sz w:val="24"/>
+                <w:szCs w:val="24"/>
+              </w:rPr>
+            </w:pPr>
+            <w:r>
+              <w:rPr>
+                <w:rFonts w:eastAsiaTheme="majorEastAsia"/>
+                <w:sz w:val="24"/>
+                <w:szCs w:val="24"/>
+              </w:rPr>
+              <w:t xml:space="preserve">Yo pienso que hemos trabajado bien en equipo no hemos tenido roces ni discusiones fuertes y tampoco tenemos integrantes bagos creo yo. </w:t>
+            </w:r>
+            <w:r>
+              <w:rPr>
+                <w:rFonts w:eastAsiaTheme="majorEastAsia"/>
+                <w:sz w:val="24"/>
+                <w:szCs w:val="24"/>
+              </w:rPr>
+              <w:t>Un Aspecto positivo que encuentro es la comunicación rápida en mi anterior grupo no contaba con esto y yo percibí mucho retraso a la hora de avanzar el proyecto pues nunca se podía llegar a puntos o alcances claros debido a no poder charlar de manera constante.</w:t>
+            </w:r>
+            <w:r>
+              <w:rPr>
+                <w:rFonts w:eastAsiaTheme="majorEastAsia"/>
+                <w:sz w:val="24"/>
+                <w:szCs w:val="24"/>
+              </w:rPr>
+              <w:t xml:space="preserve"> Es muy bueno que esto no pase en este grupo.</w:t>
+            </w:r>
+            <w:r>
+              <w:rPr>
+                <w:rFonts w:eastAsiaTheme="majorEastAsia"/>
+                <w:sz w:val="24"/>
+                <w:szCs w:val="24"/>
+              </w:rPr>
+              <w:t xml:space="preserve"> Y en aspectos negativos actualmente no soy capas de pensar en alguno.</w:t>
             </w:r>
           </w:p>
           <w:p>
@@ -1272,7 +1612,7 @@
 </file>
 
 <file path=word/endnotes.xml><?xml version="1.0" encoding="utf-8"?>
-<w:endnotes xmlns:wpc="http://schemas.microsoft.com/office/word/2010/wordprocessingCanvas" xmlns:cx="http://schemas.microsoft.com/office/drawing/2014/chartex" xmlns:mc="http://schemas.openxmlformats.org/markup-compatibility/2006" xmlns:o="urn:schemas-microsoft-com:office:office" xmlns:r="http://schemas.openxmlformats.org/officeDocument/2006/relationships" xmlns:m="http://schemas.openxmlformats.org/officeDocument/2006/math" xmlns:v="urn:schemas-microsoft-com:vml" xmlns:wp14="http://schemas.microsoft.com/office/word/2010/wordprocessingDrawing" xmlns:wp="http://schemas.openxmlformats.org/drawingml/2006/wordprocessingDrawing" xmlns:w10="urn:schemas-microsoft-com:office:word" xmlns:w="http://schemas.openxmlformats.org/wordprocessingml/2006/main" xmlns:w14="http://schemas.microsoft.com/office/word/2010/wordml" xmlns:w15="http://schemas.microsoft.com/office/word/2012/wordml" xmlns:w16se="http://schemas.microsoft.com/office/word/2015/wordml/symex" xmlns:wpg="http://schemas.microsoft.com/office/word/2010/wordprocessingGroup" xmlns:wpi="http://schemas.microsoft.com/office/word/2010/wordprocessingInk" xmlns:wne="http://schemas.microsoft.com/office/word/2006/wordml" xmlns:wps="http://schemas.microsoft.com/office/word/2010/wordprocessingShape" mc:Ignorable="w14 w15 w16se wp14">
+<w:endnotes xmlns:wpc="http://schemas.microsoft.com/office/word/2010/wordprocessingCanvas" xmlns:cx="http://schemas.microsoft.com/office/drawing/2014/chartex" xmlns:cx1="http://schemas.microsoft.com/office/drawing/2015/9/8/chartex" xmlns:cx2="http://schemas.microsoft.com/office/drawing/2015/10/21/chartex" xmlns:cx3="http://schemas.microsoft.com/office/drawing/2016/5/9/chartex" xmlns:cx4="http://schemas.microsoft.com/office/drawing/2016/5/10/chartex" xmlns:cx5="http://schemas.microsoft.com/office/drawing/2016/5/11/chartex" xmlns:cx6="http://schemas.microsoft.com/office/drawing/2016/5/12/chartex" xmlns:cx7="http://schemas.microsoft.com/office/drawing/2016/5/13/chartex" xmlns:cx8="http://schemas.microsoft.com/office/drawing/2016/5/14/chartex" xmlns:mc="http://schemas.openxmlformats.org/markup-compatibility/2006" xmlns:aink="http://schemas.microsoft.com/office/drawing/2016/ink" xmlns:am3d="http://schemas.microsoft.com/office/drawing/2017/model3d" xmlns:o="urn:schemas-microsoft-com:office:office" xmlns:oel="http://schemas.microsoft.com/office/2019/extlst" xmlns:r="http://schemas.openxmlformats.org/officeDocument/2006/relationships" xmlns:m="http://schemas.openxmlformats.org/officeDocument/2006/math" xmlns:v="urn:schemas-microsoft-com:vml" xmlns:wp14="http://schemas.microsoft.com/office/word/2010/wordprocessingDrawing" xmlns:wp="http://schemas.openxmlformats.org/drawingml/2006/wordprocessingDrawing" xmlns:w10="urn:schemas-microsoft-com:office:word" xmlns:w="http://schemas.openxmlformats.org/wordprocessingml/2006/main" xmlns:w14="http://schemas.microsoft.com/office/word/2010/wordml" xmlns:w15="http://schemas.microsoft.com/office/word/2012/wordml" xmlns:w16cex="http://schemas.microsoft.com/office/word/2018/wordml/cex" xmlns:w16cid="http://schemas.microsoft.com/office/word/2016/wordml/cid" xmlns:w16="http://schemas.microsoft.com/office/word/2018/wordml" xmlns:w16du="http://schemas.microsoft.com/office/word/2023/wordml/word16du" xmlns:w16sdtdh="http://schemas.microsoft.com/office/word/2020/wordml/sdtdatahash" xmlns:w16sdtfl="http://schemas.microsoft.com/office/word/2024/wordml/sdtformatlock" xmlns:w16se="http://schemas.microsoft.com/office/word/2015/wordml/symex" xmlns:wpg="http://schemas.microsoft.com/office/word/2010/wordprocessingGroup" xmlns:wpi="http://schemas.microsoft.com/office/word/2010/wordprocessingInk" xmlns:wne="http://schemas.microsoft.com/office/word/2006/wordml" xmlns:wps="http://schemas.microsoft.com/office/word/2010/wordprocessingShape" mc:Ignorable="w14 w15 w16se w16cid w16 w16cex w16sdtdh w16sdtfl w16du wp14">
   <w:endnote w:type="separator" w:id="-1">
     <w:p>
       <w:pPr>
@@ -1297,7 +1637,7 @@
 </file>
 
 <file path=word/footer1.xml><?xml version="1.0" encoding="utf-8"?>
-<w:ftr xmlns:wpc="http://schemas.microsoft.com/office/word/2010/wordprocessingCanvas" xmlns:cx="http://schemas.microsoft.com/office/drawing/2014/chartex" xmlns:mc="http://schemas.openxmlformats.org/markup-compatibility/2006" xmlns:o="urn:schemas-microsoft-com:office:office" xmlns:r="http://schemas.openxmlformats.org/officeDocument/2006/relationships" xmlns:m="http://schemas.openxmlformats.org/officeDocument/2006/math" xmlns:v="urn:schemas-microsoft-com:vml" xmlns:wp14="http://schemas.microsoft.com/office/word/2010/wordprocessingDrawing" xmlns:wp="http://schemas.openxmlformats.org/drawingml/2006/wordprocessingDrawing" xmlns:w10="urn:schemas-microsoft-com:office:word" xmlns:w="http://schemas.openxmlformats.org/wordprocessingml/2006/main" xmlns:w14="http://schemas.microsoft.com/office/word/2010/wordml" xmlns:w15="http://schemas.microsoft.com/office/word/2012/wordml" xmlns:w16se="http://schemas.microsoft.com/office/word/2015/wordml/symex" xmlns:wpg="http://schemas.microsoft.com/office/word/2010/wordprocessingGroup" xmlns:wpi="http://schemas.microsoft.com/office/word/2010/wordprocessingInk" xmlns:wne="http://schemas.microsoft.com/office/word/2006/wordml" xmlns:wps="http://schemas.microsoft.com/office/word/2010/wordprocessingShape" mc:Ignorable="w14 w15 w16se wp14">
+<w:ftr xmlns:wpc="http://schemas.microsoft.com/office/word/2010/wordprocessingCanvas" xmlns:cx="http://schemas.microsoft.com/office/drawing/2014/chartex" xmlns:cx1="http://schemas.microsoft.com/office/drawing/2015/9/8/chartex" xmlns:cx2="http://schemas.microsoft.com/office/drawing/2015/10/21/chartex" xmlns:cx3="http://schemas.microsoft.com/office/drawing/2016/5/9/chartex" xmlns:cx4="http://schemas.microsoft.com/office/drawing/2016/5/10/chartex" xmlns:cx5="http://schemas.microsoft.com/office/drawing/2016/5/11/chartex" xmlns:cx6="http://schemas.microsoft.com/office/drawing/2016/5/12/chartex" xmlns:cx7="http://schemas.microsoft.com/office/drawing/2016/5/13/chartex" xmlns:cx8="http://schemas.microsoft.com/office/drawing/2016/5/14/chartex" xmlns:mc="http://schemas.openxmlformats.org/markup-compatibility/2006" xmlns:aink="http://schemas.microsoft.com/office/drawing/2016/ink" xmlns:am3d="http://schemas.microsoft.com/office/drawing/2017/model3d" xmlns:o="urn:schemas-microsoft-com:office:office" xmlns:oel="http://schemas.microsoft.com/office/2019/extlst" xmlns:r="http://schemas.openxmlformats.org/officeDocument/2006/relationships" xmlns:m="http://schemas.openxmlformats.org/officeDocument/2006/math" xmlns:v="urn:schemas-microsoft-com:vml" xmlns:wp14="http://schemas.microsoft.com/office/word/2010/wordprocessingDrawing" xmlns:wp="http://schemas.openxmlformats.org/drawingml/2006/wordprocessingDrawing" xmlns:w10="urn:schemas-microsoft-com:office:word" xmlns:w="http://schemas.openxmlformats.org/wordprocessingml/2006/main" xmlns:w14="http://schemas.microsoft.com/office/word/2010/wordml" xmlns:w15="http://schemas.microsoft.com/office/word/2012/wordml" xmlns:w16cex="http://schemas.microsoft.com/office/word/2018/wordml/cex" xmlns:w16cid="http://schemas.microsoft.com/office/word/2016/wordml/cid" xmlns:w16="http://schemas.microsoft.com/office/word/2018/wordml" xmlns:w16du="http://schemas.microsoft.com/office/word/2023/wordml/word16du" xmlns:w16sdtdh="http://schemas.microsoft.com/office/word/2020/wordml/sdtdatahash" xmlns:w16sdtfl="http://schemas.microsoft.com/office/word/2024/wordml/sdtformatlock" xmlns:w16se="http://schemas.microsoft.com/office/word/2015/wordml/symex" xmlns:wpg="http://schemas.microsoft.com/office/word/2010/wordprocessingGroup" xmlns:wpi="http://schemas.microsoft.com/office/word/2010/wordprocessingInk" xmlns:wne="http://schemas.microsoft.com/office/word/2006/wordml" xmlns:wps="http://schemas.microsoft.com/office/word/2010/wordprocessingShape" mc:Ignorable="w14 w15 w16se w16cid w16 w16cex w16sdtdh w16sdtfl w16du wp14">
   <w:sdt>
     <w:sdtPr>
       <w:id w:val="-937982979"/>
@@ -1306,7 +1646,6 @@
         <w:docPartUnique/>
       </w:docPartObj>
     </w:sdtPr>
-    <w:sdtEndPr/>
     <w:sdtContent>
       <w:p>
         <w:pPr>
@@ -1518,7 +1857,7 @@
             </mc:Choice>
             <mc:Fallback>
               <w:pict>
-                <v:group w14:anchorId="51D00065" id="Grupo 32" o:spid="_x0000_s1026" style="position:absolute;margin-left:0;margin-top:0;width:610.5pt;height:15pt;z-index:251659264;mso-width-percent:1000;mso-position-horizontal:center;mso-position-horizontal-relative:page;mso-position-vertical:center;mso-position-vertical-relative:bottom-margin-area;mso-width-percent:1000" coordorigin=",14970" coordsize="12255,300" o:gfxdata="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">
+                <v:group w14:anchorId="51D00065" id="Grupo 32" o:spid="_x0000_s1026" style="position:absolute;margin-left:0;margin-top:0;width:610.5pt;height:15pt;z-index:251659264;mso-width-percent:1000;mso-position-horizontal:center;mso-position-horizontal-relative:page;mso-position-vertical:center;mso-position-vertical-relative:bottom-margin-area;mso-width-percent:1000" coordorigin=",14970" coordsize="12255,300" o:gfxdata="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">
                   <v:shapetype id="_x0000_t202" coordsize="21600,21600" o:spt="202" path="m,l,21600r21600,l21600,xe">
                     <v:stroke joinstyle="miter"/>
                     <v:path gradientshapeok="t" o:connecttype="rect"/>
@@ -1585,7 +1924,7 @@
 </file>
 
 <file path=word/footnotes.xml><?xml version="1.0" encoding="utf-8"?>
-<w:footnotes xmlns:wpc="http://schemas.microsoft.com/office/word/2010/wordprocessingCanvas" xmlns:cx="http://schemas.microsoft.com/office/drawing/2014/chartex" xmlns:mc="http://schemas.openxmlformats.org/markup-compatibility/2006" xmlns:o="urn:schemas-microsoft-com:office:office" xmlns:r="http://schemas.openxmlformats.org/officeDocument/2006/relationships" xmlns:m="http://schemas.openxmlformats.org/officeDocument/2006/math" xmlns:v="urn:schemas-microsoft-com:vml" xmlns:wp14="http://schemas.microsoft.com/office/word/2010/wordprocessingDrawing" xmlns:wp="http://schemas.openxmlformats.org/drawingml/2006/wordprocessingDrawing" xmlns:w10="urn:schemas-microsoft-com:office:word" xmlns:w="http://schemas.openxmlformats.org/wordprocessingml/2006/main" xmlns:w14="http://schemas.microsoft.com/office/word/2010/wordml" xmlns:w15="http://schemas.microsoft.com/office/word/2012/wordml" xmlns:w16se="http://schemas.microsoft.com/office/word/2015/wordml/symex" xmlns:wpg="http://schemas.microsoft.com/office/word/2010/wordprocessingGroup" xmlns:wpi="http://schemas.microsoft.com/office/word/2010/wordprocessingInk" xmlns:wne="http://schemas.microsoft.com/office/word/2006/wordml" xmlns:wps="http://schemas.microsoft.com/office/word/2010/wordprocessingShape" mc:Ignorable="w14 w15 w16se wp14">
+<w:footnotes xmlns:wpc="http://schemas.microsoft.com/office/word/2010/wordprocessingCanvas" xmlns:cx="http://schemas.microsoft.com/office/drawing/2014/chartex" xmlns:cx1="http://schemas.microsoft.com/office/drawing/2015/9/8/chartex" xmlns:cx2="http://schemas.microsoft.com/office/drawing/2015/10/21/chartex" xmlns:cx3="http://schemas.microsoft.com/office/drawing/2016/5/9/chartex" xmlns:cx4="http://schemas.microsoft.com/office/drawing/2016/5/10/chartex" xmlns:cx5="http://schemas.microsoft.com/office/drawing/2016/5/11/chartex" xmlns:cx6="http://schemas.microsoft.com/office/drawing/2016/5/12/chartex" xmlns:cx7="http://schemas.microsoft.com/office/drawing/2016/5/13/chartex" xmlns:cx8="http://schemas.microsoft.com/office/drawing/2016/5/14/chartex" xmlns:mc="http://schemas.openxmlformats.org/markup-compatibility/2006" xmlns:aink="http://schemas.microsoft.com/office/drawing/2016/ink" xmlns:am3d="http://schemas.microsoft.com/office/drawing/2017/model3d" xmlns:o="urn:schemas-microsoft-com:office:office" xmlns:oel="http://schemas.microsoft.com/office/2019/extlst" xmlns:r="http://schemas.openxmlformats.org/officeDocument/2006/relationships" xmlns:m="http://schemas.openxmlformats.org/officeDocument/2006/math" xmlns:v="urn:schemas-microsoft-com:vml" xmlns:wp14="http://schemas.microsoft.com/office/word/2010/wordprocessingDrawing" xmlns:wp="http://schemas.openxmlformats.org/drawingml/2006/wordprocessingDrawing" xmlns:w10="urn:schemas-microsoft-com:office:word" xmlns:w="http://schemas.openxmlformats.org/wordprocessingml/2006/main" xmlns:w14="http://schemas.microsoft.com/office/word/2010/wordml" xmlns:w15="http://schemas.microsoft.com/office/word/2012/wordml" xmlns:w16cex="http://schemas.microsoft.com/office/word/2018/wordml/cex" xmlns:w16cid="http://schemas.microsoft.com/office/word/2016/wordml/cid" xmlns:w16="http://schemas.microsoft.com/office/word/2018/wordml" xmlns:w16du="http://schemas.microsoft.com/office/word/2023/wordml/word16du" xmlns:w16sdtdh="http://schemas.microsoft.com/office/word/2020/wordml/sdtdatahash" xmlns:w16sdtfl="http://schemas.microsoft.com/office/word/2024/wordml/sdtformatlock" xmlns:w16se="http://schemas.microsoft.com/office/word/2015/wordml/symex" xmlns:wpg="http://schemas.microsoft.com/office/word/2010/wordprocessingGroup" xmlns:wpi="http://schemas.microsoft.com/office/word/2010/wordprocessingInk" xmlns:wne="http://schemas.microsoft.com/office/word/2006/wordml" xmlns:wps="http://schemas.microsoft.com/office/word/2010/wordprocessingShape" mc:Ignorable="w14 w15 w16se w16cid w16 w16cex w16sdtdh w16sdtfl w16du wp14">
   <w:footnote w:type="separator" w:id="-1">
     <w:p>
       <w:pPr>
@@ -1610,7 +1949,7 @@
 </file>
 
 <file path=word/header1.xml><?xml version="1.0" encoding="utf-8"?>
-<w:hdr xmlns:wpc="http://schemas.microsoft.com/office/word/2010/wordprocessingCanvas" xmlns:cx="http://schemas.microsoft.com/office/drawing/2014/chartex" xmlns:mc="http://schemas.openxmlformats.org/markup-compatibility/2006" xmlns:o="urn:schemas-microsoft-com:office:office" xmlns:r="http://schemas.openxmlformats.org/officeDocument/2006/relationships" xmlns:m="http://schemas.openxmlformats.org/officeDocument/2006/math" xmlns:v="urn:schemas-microsoft-com:vml" xmlns:wp14="http://schemas.microsoft.com/office/word/2010/wordprocessingDrawing" xmlns:wp="http://schemas.openxmlformats.org/drawingml/2006/wordprocessingDrawing" xmlns:w10="urn:schemas-microsoft-com:office:word" xmlns:w="http://schemas.openxmlformats.org/wordprocessingml/2006/main" xmlns:w14="http://schemas.microsoft.com/office/word/2010/wordml" xmlns:w15="http://schemas.microsoft.com/office/word/2012/wordml" xmlns:w16se="http://schemas.microsoft.com/office/word/2015/wordml/symex" xmlns:wpg="http://schemas.microsoft.com/office/word/2010/wordprocessingGroup" xmlns:wpi="http://schemas.microsoft.com/office/word/2010/wordprocessingInk" xmlns:wne="http://schemas.microsoft.com/office/word/2006/wordml" xmlns:wps="http://schemas.microsoft.com/office/word/2010/wordprocessingShape" mc:Ignorable="w14 w15 w16se wp14">
+<w:hdr xmlns:wpc="http://schemas.microsoft.com/office/word/2010/wordprocessingCanvas" xmlns:cx="http://schemas.microsoft.com/office/drawing/2014/chartex" xmlns:cx1="http://schemas.microsoft.com/office/drawing/2015/9/8/chartex" xmlns:cx2="http://schemas.microsoft.com/office/drawing/2015/10/21/chartex" xmlns:cx3="http://schemas.microsoft.com/office/drawing/2016/5/9/chartex" xmlns:cx4="http://schemas.microsoft.com/office/drawing/2016/5/10/chartex" xmlns:cx5="http://schemas.microsoft.com/office/drawing/2016/5/11/chartex" xmlns:cx6="http://schemas.microsoft.com/office/drawing/2016/5/12/chartex" xmlns:cx7="http://schemas.microsoft.com/office/drawing/2016/5/13/chartex" xmlns:cx8="http://schemas.microsoft.com/office/drawing/2016/5/14/chartex" xmlns:mc="http://schemas.openxmlformats.org/markup-compatibility/2006" xmlns:aink="http://schemas.microsoft.com/office/drawing/2016/ink" xmlns:am3d="http://schemas.microsoft.com/office/drawing/2017/model3d" xmlns:o="urn:schemas-microsoft-com:office:office" xmlns:oel="http://schemas.microsoft.com/office/2019/extlst" xmlns:r="http://schemas.openxmlformats.org/officeDocument/2006/relationships" xmlns:m="http://schemas.openxmlformats.org/officeDocument/2006/math" xmlns:v="urn:schemas-microsoft-com:vml" xmlns:wp14="http://schemas.microsoft.com/office/word/2010/wordprocessingDrawing" xmlns:wp="http://schemas.openxmlformats.org/drawingml/2006/wordprocessingDrawing" xmlns:w10="urn:schemas-microsoft-com:office:word" xmlns:w="http://schemas.openxmlformats.org/wordprocessingml/2006/main" xmlns:w14="http://schemas.microsoft.com/office/word/2010/wordml" xmlns:w15="http://schemas.microsoft.com/office/word/2012/wordml" xmlns:w16cex="http://schemas.microsoft.com/office/word/2018/wordml/cex" xmlns:w16cid="http://schemas.microsoft.com/office/word/2016/wordml/cid" xmlns:w16="http://schemas.microsoft.com/office/word/2018/wordml" xmlns:w16du="http://schemas.microsoft.com/office/word/2023/wordml/word16du" xmlns:w16sdtdh="http://schemas.microsoft.com/office/word/2020/wordml/sdtdatahash" xmlns:w16sdtfl="http://schemas.microsoft.com/office/word/2024/wordml/sdtformatlock" xmlns:w16se="http://schemas.microsoft.com/office/word/2015/wordml/symex" xmlns:wpg="http://schemas.microsoft.com/office/word/2010/wordprocessingGroup" xmlns:wpi="http://schemas.microsoft.com/office/word/2010/wordprocessingInk" xmlns:wne="http://schemas.microsoft.com/office/word/2006/wordml" xmlns:wps="http://schemas.microsoft.com/office/word/2010/wordprocessingShape" mc:Ignorable="w14 w15 w16se w16cid w16 w16cex w16sdtdh w16sdtfl w16du wp14">
   <w:tbl>
     <w:tblPr>
       <w:tblStyle w:val="Tablaconcuadrcula"/>
@@ -1790,7 +2129,7 @@
 </file>
 
 <file path=word/header2.xml><?xml version="1.0" encoding="utf-8"?>
-<w:hdr xmlns:wpc="http://schemas.microsoft.com/office/word/2010/wordprocessingCanvas" xmlns:cx="http://schemas.microsoft.com/office/drawing/2014/chartex" xmlns:mc="http://schemas.openxmlformats.org/markup-compatibility/2006" xmlns:o="urn:schemas-microsoft-com:office:office" xmlns:r="http://schemas.openxmlformats.org/officeDocument/2006/relationships" xmlns:m="http://schemas.openxmlformats.org/officeDocument/2006/math" xmlns:v="urn:schemas-microsoft-com:vml" xmlns:wp14="http://schemas.microsoft.com/office/word/2010/wordprocessingDrawing" xmlns:wp="http://schemas.openxmlformats.org/drawingml/2006/wordprocessingDrawing" xmlns:w10="urn:schemas-microsoft-com:office:word" xmlns:w="http://schemas.openxmlformats.org/wordprocessingml/2006/main" xmlns:w14="http://schemas.microsoft.com/office/word/2010/wordml" xmlns:w15="http://schemas.microsoft.com/office/word/2012/wordml" xmlns:w16se="http://schemas.microsoft.com/office/word/2015/wordml/symex" xmlns:wpg="http://schemas.microsoft.com/office/word/2010/wordprocessingGroup" xmlns:wpi="http://schemas.microsoft.com/office/word/2010/wordprocessingInk" xmlns:wne="http://schemas.microsoft.com/office/word/2006/wordml" xmlns:wps="http://schemas.microsoft.com/office/word/2010/wordprocessingShape" mc:Ignorable="w14 w15 w16se wp14">
+<w:hdr xmlns:wpc="http://schemas.microsoft.com/office/word/2010/wordprocessingCanvas" xmlns:cx="http://schemas.microsoft.com/office/drawing/2014/chartex" xmlns:cx1="http://schemas.microsoft.com/office/drawing/2015/9/8/chartex" xmlns:cx2="http://schemas.microsoft.com/office/drawing/2015/10/21/chartex" xmlns:cx3="http://schemas.microsoft.com/office/drawing/2016/5/9/chartex" xmlns:cx4="http://schemas.microsoft.com/office/drawing/2016/5/10/chartex" xmlns:cx5="http://schemas.microsoft.com/office/drawing/2016/5/11/chartex" xmlns:cx6="http://schemas.microsoft.com/office/drawing/2016/5/12/chartex" xmlns:cx7="http://schemas.microsoft.com/office/drawing/2016/5/13/chartex" xmlns:cx8="http://schemas.microsoft.com/office/drawing/2016/5/14/chartex" xmlns:mc="http://schemas.openxmlformats.org/markup-compatibility/2006" xmlns:aink="http://schemas.microsoft.com/office/drawing/2016/ink" xmlns:am3d="http://schemas.microsoft.com/office/drawing/2017/model3d" xmlns:o="urn:schemas-microsoft-com:office:office" xmlns:oel="http://schemas.microsoft.com/office/2019/extlst" xmlns:r="http://schemas.openxmlformats.org/officeDocument/2006/relationships" xmlns:m="http://schemas.openxmlformats.org/officeDocument/2006/math" xmlns:v="urn:schemas-microsoft-com:vml" xmlns:wp14="http://schemas.microsoft.com/office/word/2010/wordprocessingDrawing" xmlns:wp="http://schemas.openxmlformats.org/drawingml/2006/wordprocessingDrawing" xmlns:w10="urn:schemas-microsoft-com:office:word" xmlns:w="http://schemas.openxmlformats.org/wordprocessingml/2006/main" xmlns:w14="http://schemas.microsoft.com/office/word/2010/wordml" xmlns:w15="http://schemas.microsoft.com/office/word/2012/wordml" xmlns:w16cex="http://schemas.microsoft.com/office/word/2018/wordml/cex" xmlns:w16cid="http://schemas.microsoft.com/office/word/2016/wordml/cid" xmlns:w16="http://schemas.microsoft.com/office/word/2018/wordml" xmlns:w16du="http://schemas.microsoft.com/office/word/2023/wordml/word16du" xmlns:w16sdtdh="http://schemas.microsoft.com/office/word/2020/wordml/sdtdatahash" xmlns:w16sdtfl="http://schemas.microsoft.com/office/word/2024/wordml/sdtformatlock" xmlns:w16se="http://schemas.microsoft.com/office/word/2015/wordml/symex" xmlns:wpg="http://schemas.microsoft.com/office/word/2010/wordprocessingGroup" xmlns:wpi="http://schemas.microsoft.com/office/word/2010/wordprocessingInk" xmlns:wne="http://schemas.microsoft.com/office/word/2006/wordml" xmlns:wps="http://schemas.microsoft.com/office/word/2010/wordprocessingShape" mc:Ignorable="w14 w15 w16se w16cid w16 w16cex w16sdtdh w16sdtfl w16du wp14">
   <w:tbl>
     <w:tblPr>
       <w:tblStyle w:val="Tablaconcuadrcula"/>
@@ -2065,7 +2404,7 @@
 </file>
 
 <file path=word/numbering.xml><?xml version="1.0" encoding="utf-8"?>
-<w:numbering xmlns:wpc="http://schemas.microsoft.com/office/word/2010/wordprocessingCanvas" xmlns:cx="http://schemas.microsoft.com/office/drawing/2014/chartex" xmlns:mc="http://schemas.openxmlformats.org/markup-compatibility/2006" xmlns:o="urn:schemas-microsoft-com:office:office" xmlns:r="http://schemas.openxmlformats.org/officeDocument/2006/relationships" xmlns:m="http://schemas.openxmlformats.org/officeDocument/2006/math" xmlns:v="urn:schemas-microsoft-com:vml" xmlns:wp14="http://schemas.microsoft.com/office/word/2010/wordprocessingDrawing" xmlns:wp="http://schemas.openxmlformats.org/drawingml/2006/wordprocessingDrawing" xmlns:w10="urn:schemas-microsoft-com:office:word" xmlns:w="http://schemas.openxmlformats.org/wordprocessingml/2006/main" xmlns:w14="http://schemas.microsoft.com/office/word/2010/wordml" xmlns:w15="http://schemas.microsoft.com/office/word/2012/wordml" xmlns:w16se="http://schemas.microsoft.com/office/word/2015/wordml/symex" xmlns:wpg="http://schemas.microsoft.com/office/word/2010/wordprocessingGroup" xmlns:wpi="http://schemas.microsoft.com/office/word/2010/wordprocessingInk" xmlns:wne="http://schemas.microsoft.com/office/word/2006/wordml" xmlns:wps="http://schemas.microsoft.com/office/word/2010/wordprocessingShape" mc:Ignorable="w14 w15 w16se wp14">
+<w:numbering xmlns:wpc="http://schemas.microsoft.com/office/word/2010/wordprocessingCanvas" xmlns:cx="http://schemas.microsoft.com/office/drawing/2014/chartex" xmlns:cx1="http://schemas.microsoft.com/office/drawing/2015/9/8/chartex" xmlns:cx2="http://schemas.microsoft.com/office/drawing/2015/10/21/chartex" xmlns:cx3="http://schemas.microsoft.com/office/drawing/2016/5/9/chartex" xmlns:cx4="http://schemas.microsoft.com/office/drawing/2016/5/10/chartex" xmlns:cx5="http://schemas.microsoft.com/office/drawing/2016/5/11/chartex" xmlns:cx6="http://schemas.microsoft.com/office/drawing/2016/5/12/chartex" xmlns:cx7="http://schemas.microsoft.com/office/drawing/2016/5/13/chartex" xmlns:cx8="http://schemas.microsoft.com/office/drawing/2016/5/14/chartex" xmlns:mc="http://schemas.openxmlformats.org/markup-compatibility/2006" xmlns:aink="http://schemas.microsoft.com/office/drawing/2016/ink" xmlns:am3d="http://schemas.microsoft.com/office/drawing/2017/model3d" xmlns:o="urn:schemas-microsoft-com:office:office" xmlns:oel="http://schemas.microsoft.com/office/2019/extlst" xmlns:r="http://schemas.openxmlformats.org/officeDocument/2006/relationships" xmlns:m="http://schemas.openxmlformats.org/officeDocument/2006/math" xmlns:v="urn:schemas-microsoft-com:vml" xmlns:wp14="http://schemas.microsoft.com/office/word/2010/wordprocessingDrawing" xmlns:wp="http://schemas.openxmlformats.org/drawingml/2006/wordprocessingDrawing" xmlns:w10="urn:schemas-microsoft-com:office:word" xmlns:w="http://schemas.openxmlformats.org/wordprocessingml/2006/main" xmlns:w14="http://schemas.microsoft.com/office/word/2010/wordml" xmlns:w15="http://schemas.microsoft.com/office/word/2012/wordml" xmlns:w16cex="http://schemas.microsoft.com/office/word/2018/wordml/cex" xmlns:w16cid="http://schemas.microsoft.com/office/word/2016/wordml/cid" xmlns:w16="http://schemas.microsoft.com/office/word/2018/wordml" xmlns:w16du="http://schemas.microsoft.com/office/word/2023/wordml/word16du" xmlns:w16sdtdh="http://schemas.microsoft.com/office/word/2020/wordml/sdtdatahash" xmlns:w16sdtfl="http://schemas.microsoft.com/office/word/2024/wordml/sdtformatlock" xmlns:w16se="http://schemas.microsoft.com/office/word/2015/wordml/symex" xmlns:wpg="http://schemas.microsoft.com/office/word/2010/wordprocessingGroup" xmlns:wpi="http://schemas.microsoft.com/office/word/2010/wordprocessingInk" xmlns:wne="http://schemas.microsoft.com/office/word/2006/wordml" xmlns:wps="http://schemas.microsoft.com/office/word/2010/wordprocessingShape" mc:Ignorable="w14 w15 w16se w16cid w16 w16cex w16sdtdh w16sdtfl w16du wp14">
   <w:abstractNum w:abstractNumId="0" w15:restartNumberingAfterBreak="0">
     <w:nsid w:val="049156A1"/>
     <w:multiLevelType w:val="hybridMultilevel"/>
@@ -6639,124 +6978,124 @@
       </w:rPr>
     </w:lvl>
   </w:abstractNum>
-  <w:num w:numId="1">
+  <w:num w:numId="1" w16cid:durableId="1314679505">
     <w:abstractNumId w:val="3"/>
   </w:num>
-  <w:num w:numId="2">
+  <w:num w:numId="2" w16cid:durableId="197819167">
     <w:abstractNumId w:val="8"/>
   </w:num>
-  <w:num w:numId="3">
+  <w:num w:numId="3" w16cid:durableId="920332896">
     <w:abstractNumId w:val="12"/>
   </w:num>
-  <w:num w:numId="4">
+  <w:num w:numId="4" w16cid:durableId="573709392">
     <w:abstractNumId w:val="28"/>
   </w:num>
-  <w:num w:numId="5">
+  <w:num w:numId="5" w16cid:durableId="1544440052">
     <w:abstractNumId w:val="30"/>
   </w:num>
-  <w:num w:numId="6">
+  <w:num w:numId="6" w16cid:durableId="1719088770">
     <w:abstractNumId w:val="4"/>
   </w:num>
-  <w:num w:numId="7">
+  <w:num w:numId="7" w16cid:durableId="348675689">
     <w:abstractNumId w:val="11"/>
   </w:num>
-  <w:num w:numId="8">
+  <w:num w:numId="8" w16cid:durableId="788280627">
     <w:abstractNumId w:val="19"/>
   </w:num>
-  <w:num w:numId="9">
+  <w:num w:numId="9" w16cid:durableId="1988701083">
     <w:abstractNumId w:val="15"/>
   </w:num>
-  <w:num w:numId="10">
+  <w:num w:numId="10" w16cid:durableId="1199972161">
     <w:abstractNumId w:val="9"/>
   </w:num>
-  <w:num w:numId="11">
+  <w:num w:numId="11" w16cid:durableId="1394935811">
     <w:abstractNumId w:val="24"/>
   </w:num>
-  <w:num w:numId="12">
+  <w:num w:numId="12" w16cid:durableId="759178534">
     <w:abstractNumId w:val="35"/>
   </w:num>
-  <w:num w:numId="13">
+  <w:num w:numId="13" w16cid:durableId="1333484232">
     <w:abstractNumId w:val="29"/>
   </w:num>
-  <w:num w:numId="14">
+  <w:num w:numId="14" w16cid:durableId="884146879">
     <w:abstractNumId w:val="1"/>
   </w:num>
-  <w:num w:numId="15">
+  <w:num w:numId="15" w16cid:durableId="318852866">
     <w:abstractNumId w:val="36"/>
   </w:num>
-  <w:num w:numId="16">
+  <w:num w:numId="16" w16cid:durableId="2122798830">
     <w:abstractNumId w:val="21"/>
   </w:num>
-  <w:num w:numId="17">
+  <w:num w:numId="17" w16cid:durableId="1306813530">
     <w:abstractNumId w:val="17"/>
   </w:num>
-  <w:num w:numId="18">
+  <w:num w:numId="18" w16cid:durableId="1417439415">
     <w:abstractNumId w:val="31"/>
   </w:num>
-  <w:num w:numId="19">
+  <w:num w:numId="19" w16cid:durableId="2069841339">
     <w:abstractNumId w:val="10"/>
   </w:num>
-  <w:num w:numId="20">
+  <w:num w:numId="20" w16cid:durableId="2119762204">
     <w:abstractNumId w:val="39"/>
   </w:num>
-  <w:num w:numId="21">
+  <w:num w:numId="21" w16cid:durableId="1704476967">
     <w:abstractNumId w:val="34"/>
   </w:num>
-  <w:num w:numId="22">
+  <w:num w:numId="22" w16cid:durableId="1030493564">
     <w:abstractNumId w:val="13"/>
   </w:num>
-  <w:num w:numId="23">
+  <w:num w:numId="23" w16cid:durableId="1832519548">
     <w:abstractNumId w:val="14"/>
   </w:num>
-  <w:num w:numId="24">
+  <w:num w:numId="24" w16cid:durableId="1164012466">
     <w:abstractNumId w:val="5"/>
   </w:num>
-  <w:num w:numId="25">
+  <w:num w:numId="25" w16cid:durableId="2073231915">
     <w:abstractNumId w:val="16"/>
   </w:num>
-  <w:num w:numId="26">
+  <w:num w:numId="26" w16cid:durableId="1308045810">
     <w:abstractNumId w:val="20"/>
   </w:num>
-  <w:num w:numId="27">
+  <w:num w:numId="27" w16cid:durableId="1069842017">
     <w:abstractNumId w:val="23"/>
   </w:num>
-  <w:num w:numId="28">
+  <w:num w:numId="28" w16cid:durableId="1291329073">
     <w:abstractNumId w:val="0"/>
   </w:num>
-  <w:num w:numId="29">
+  <w:num w:numId="29" w16cid:durableId="1352100850">
     <w:abstractNumId w:val="18"/>
   </w:num>
-  <w:num w:numId="30">
+  <w:num w:numId="30" w16cid:durableId="1732342654">
     <w:abstractNumId w:val="22"/>
   </w:num>
-  <w:num w:numId="31">
+  <w:num w:numId="31" w16cid:durableId="1698655426">
     <w:abstractNumId w:val="2"/>
   </w:num>
-  <w:num w:numId="32">
+  <w:num w:numId="32" w16cid:durableId="640572574">
     <w:abstractNumId w:val="7"/>
   </w:num>
-  <w:num w:numId="33">
+  <w:num w:numId="33" w16cid:durableId="1558206190">
     <w:abstractNumId w:val="32"/>
   </w:num>
-  <w:num w:numId="34">
+  <w:num w:numId="34" w16cid:durableId="994916348">
     <w:abstractNumId w:val="38"/>
   </w:num>
-  <w:num w:numId="35">
+  <w:num w:numId="35" w16cid:durableId="937638805">
     <w:abstractNumId w:val="6"/>
   </w:num>
-  <w:num w:numId="36">
+  <w:num w:numId="36" w16cid:durableId="118423665">
     <w:abstractNumId w:val="25"/>
   </w:num>
-  <w:num w:numId="37">
+  <w:num w:numId="37" w16cid:durableId="65497102">
     <w:abstractNumId w:val="37"/>
   </w:num>
-  <w:num w:numId="38">
+  <w:num w:numId="38" w16cid:durableId="1863087345">
     <w:abstractNumId w:val="27"/>
   </w:num>
-  <w:num w:numId="39">
+  <w:num w:numId="39" w16cid:durableId="1139306684">
     <w:abstractNumId w:val="26"/>
   </w:num>
-  <w:num w:numId="40">
+  <w:num w:numId="40" w16cid:durableId="1954743862">
     <w:abstractNumId w:val="33"/>
   </w:num>
   <w:numIdMacAtCleanup w:val="18"/>
@@ -6764,7 +7103,7 @@
 </file>
 
 <file path=word/styles.xml><?xml version="1.0" encoding="utf-8"?>
-<w:styles xmlns:mc="http://schemas.openxmlformats.org/markup-compatibility/2006" xmlns:r="http://schemas.openxmlformats.org/officeDocument/2006/relationships" xmlns:w="http://schemas.openxmlformats.org/wordprocessingml/2006/main" xmlns:w14="http://schemas.microsoft.com/office/word/2010/wordml" xmlns:w15="http://schemas.microsoft.com/office/word/2012/wordml" xmlns:w16se="http://schemas.microsoft.com/office/word/2015/wordml/symex" mc:Ignorable="w14 w15 w16se">
+<w:styles xmlns:mc="http://schemas.openxmlformats.org/markup-compatibility/2006" xmlns:r="http://schemas.openxmlformats.org/officeDocument/2006/relationships" xmlns:w="http://schemas.openxmlformats.org/wordprocessingml/2006/main" xmlns:w14="http://schemas.microsoft.com/office/word/2010/wordml" xmlns:w15="http://schemas.microsoft.com/office/word/2012/wordml" xmlns:w16cex="http://schemas.microsoft.com/office/word/2018/wordml/cex" xmlns:w16cid="http://schemas.microsoft.com/office/word/2016/wordml/cid" xmlns:w16="http://schemas.microsoft.com/office/word/2018/wordml" xmlns:w16du="http://schemas.microsoft.com/office/word/2023/wordml/word16du" xmlns:w16sdtdh="http://schemas.microsoft.com/office/word/2020/wordml/sdtdatahash" xmlns:w16sdtfl="http://schemas.microsoft.com/office/word/2024/wordml/sdtformatlock" xmlns:w16se="http://schemas.microsoft.com/office/word/2015/wordml/symex" mc:Ignorable="w14 w15 w16se w16cid w16 w16cex w16sdtdh w16sdtfl w16du">
   <w:docDefaults>
     <w:rPrDefault>
       <w:rPr>
@@ -6780,7 +7119,7 @@
       </w:pPr>
     </w:pPrDefault>
   </w:docDefaults>
-  <w:latentStyles w:defLockedState="0" w:defUIPriority="99" w:defSemiHidden="0" w:defUnhideWhenUsed="0" w:defQFormat="0" w:count="371">
+  <w:latentStyles w:defLockedState="0" w:defUIPriority="99" w:defSemiHidden="0" w:defUnhideWhenUsed="0" w:defQFormat="0" w:count="376">
     <w:lsdException w:name="Normal" w:uiPriority="0" w:qFormat="1"/>
     <w:lsdException w:name="heading 1" w:uiPriority="9" w:qFormat="1"/>
     <w:lsdException w:name="heading 2" w:semiHidden="1" w:uiPriority="9" w:unhideWhenUsed="1" w:qFormat="1"/>
@@ -7152,6 +7491,11 @@
     <w:lsdException w:name="List Table 5 Dark Accent 6" w:uiPriority="50"/>
     <w:lsdException w:name="List Table 6 Colorful Accent 6" w:uiPriority="51"/>
     <w:lsdException w:name="List Table 7 Colorful Accent 6" w:uiPriority="52"/>
+    <w:lsdException w:name="Mention" w:semiHidden="1" w:unhideWhenUsed="1"/>
+    <w:lsdException w:name="Smart Hyperlink" w:semiHidden="1" w:unhideWhenUsed="1"/>
+    <w:lsdException w:name="Hashtag" w:semiHidden="1" w:unhideWhenUsed="1"/>
+    <w:lsdException w:name="Unresolved Mention" w:semiHidden="1" w:unhideWhenUsed="1"/>
+    <w:lsdException w:name="Smart Link" w:semiHidden="1" w:unhideWhenUsed="1"/>
   </w:latentStyles>
   <w:style w:type="paragraph" w:default="1" w:styleId="Normal">
     <w:name w:val="Normal"/>
@@ -8135,7 +8479,7 @@
       <w:szCs w:val="24"/>
     </w:rPr>
   </w:style>
-  <w:style w:type="table" w:styleId="Cuadrculadetablaclara">
+  <w:style w:type="table" w:styleId="Tablaconcuadrculaclara">
     <w:name w:val="Grid Table Light"/>
     <w:basedOn w:val="Tablanormal"/>
     <w:uiPriority w:val="40"/>
@@ -8157,7 +8501,7 @@
   <w:style w:type="table" w:customStyle="1" w:styleId="Cuadrculadetablaclara1">
     <w:name w:val="Cuadrícula de tabla clara1"/>
     <w:basedOn w:val="Tablanormal"/>
-    <w:next w:val="Cuadrculadetablaclara"/>
+    <w:next w:val="Tablaconcuadrculaclara"/>
     <w:uiPriority w:val="40"/>
     <w:rsid w:val="00943DF1"/>
     <w:pPr>
@@ -8198,7 +8542,7 @@
       <w:spacing w:after="0" w:line="240" w:lineRule="auto"/>
     </w:pPr>
   </w:style>
-  <w:style w:type="character" w:styleId="Textoennegrita">
+  <w:style w:type="character" w:styleId="Fuerte">
     <w:name w:val="Strong"/>
     <w:basedOn w:val="Fuentedeprrafopredeter"/>
     <w:uiPriority w:val="22"/>
@@ -8210,532 +8554,6 @@
     </w:rPr>
   </w:style>
 </w:styles>
-</file>
-
-<file path=word/glossary/document.xml><?xml version="1.0" encoding="utf-8"?>
-<w:glossaryDocument xmlns:wpc="http://schemas.microsoft.com/office/word/2010/wordprocessingCanvas" xmlns:cx="http://schemas.microsoft.com/office/drawing/2014/chartex" xmlns:mc="http://schemas.openxmlformats.org/markup-compatibility/2006" xmlns:o="urn:schemas-microsoft-com:office:office" xmlns:r="http://schemas.openxmlformats.org/officeDocument/2006/relationships" xmlns:m="http://schemas.openxmlformats.org/officeDocument/2006/math" xmlns:v="urn:schemas-microsoft-com:vml" xmlns:wp14="http://schemas.microsoft.com/office/word/2010/wordprocessingDrawing" xmlns:wp="http://schemas.openxmlformats.org/drawingml/2006/wordprocessingDrawing" xmlns:w10="urn:schemas-microsoft-com:office:word" xmlns:w="http://schemas.openxmlformats.org/wordprocessingml/2006/main" xmlns:w14="http://schemas.microsoft.com/office/word/2010/wordml" xmlns:w15="http://schemas.microsoft.com/office/word/2012/wordml" xmlns:w16se="http://schemas.microsoft.com/office/word/2015/wordml/symex" xmlns:wpg="http://schemas.microsoft.com/office/word/2010/wordprocessingGroup" xmlns:wpi="http://schemas.microsoft.com/office/word/2010/wordprocessingInk" xmlns:wne="http://schemas.microsoft.com/office/word/2006/wordml" xmlns:wps="http://schemas.microsoft.com/office/word/2010/wordprocessingShape" mc:Ignorable="w14 w15 w16se wp14"/>
-</file>
-
-<file path=word/glossary/fontTable.xml><?xml version="1.0" encoding="utf-8"?>
-<w:fonts xmlns:mc="http://schemas.openxmlformats.org/markup-compatibility/2006" xmlns:r="http://schemas.openxmlformats.org/officeDocument/2006/relationships" xmlns:w="http://schemas.openxmlformats.org/wordprocessingml/2006/main" xmlns:w14="http://schemas.microsoft.com/office/word/2010/wordml" xmlns:w15="http://schemas.microsoft.com/office/word/2012/wordml" xmlns:w16se="http://schemas.microsoft.com/office/word/2015/wordml/symex" mc:Ignorable="w14 w15 w16se">
-  <w:font w:name="Calibri">
-    <w:panose1 w:val="020F0502020204030204"/>
-    <w:charset w:val="00"/>
-    <w:family w:val="swiss"/>
-    <w:pitch w:val="variable"/>
-    <w:sig w:usb0="E4002EFF" w:usb1="C000247B" w:usb2="00000009" w:usb3="00000000" w:csb0="000001FF" w:csb1="00000000"/>
-  </w:font>
-  <w:font w:name="Times New Roman">
-    <w:panose1 w:val="02020603050405020304"/>
-    <w:charset w:val="00"/>
-    <w:family w:val="roman"/>
-    <w:pitch w:val="variable"/>
-    <w:sig w:usb0="E0002EFF" w:usb1="C000785B" w:usb2="00000009" w:usb3="00000000" w:csb0="000001FF" w:csb1="00000000"/>
-  </w:font>
-  <w:font w:name="Courier New">
-    <w:panose1 w:val="02070309020205020404"/>
-    <w:charset w:val="00"/>
-    <w:family w:val="modern"/>
-    <w:pitch w:val="fixed"/>
-    <w:sig w:usb0="E0002EFF" w:usb1="C0007843" w:usb2="00000009" w:usb3="00000000" w:csb0="000001FF" w:csb1="00000000"/>
-  </w:font>
-  <w:font w:name="Wingdings">
-    <w:panose1 w:val="05000000000000000000"/>
-    <w:charset w:val="02"/>
-    <w:family w:val="auto"/>
-    <w:pitch w:val="variable"/>
-    <w:sig w:usb0="00000000" w:usb1="10000000" w:usb2="00000000" w:usb3="00000000" w:csb0="80000000" w:csb1="00000000"/>
-  </w:font>
-  <w:font w:name="Symbol">
-    <w:panose1 w:val="05050102010706020507"/>
-    <w:charset w:val="02"/>
-    <w:family w:val="roman"/>
-    <w:pitch w:val="variable"/>
-    <w:sig w:usb0="00000000" w:usb1="10000000" w:usb2="00000000" w:usb3="00000000" w:csb0="80000000" w:csb1="00000000"/>
-  </w:font>
-  <w:font w:name="Calibri Light">
-    <w:panose1 w:val="020F0302020204030204"/>
-    <w:charset w:val="00"/>
-    <w:family w:val="swiss"/>
-    <w:pitch w:val="variable"/>
-    <w:sig w:usb0="E4002EFF" w:usb1="C000247B" w:usb2="00000009" w:usb3="00000000" w:csb0="000001FF" w:csb1="00000000"/>
-  </w:font>
-  <w:font w:name="Segoe UI">
-    <w:panose1 w:val="020B0502040204020203"/>
-    <w:charset w:val="00"/>
-    <w:family w:val="swiss"/>
-    <w:pitch w:val="variable"/>
-    <w:sig w:usb0="E4002EFF" w:usb1="C000E47F" w:usb2="00000009" w:usb3="00000000" w:csb0="000001FF" w:csb1="00000000"/>
-  </w:font>
-  <w:font w:name="Century Gothic">
-    <w:panose1 w:val="020B0502020202020204"/>
-    <w:charset w:val="00"/>
-    <w:family w:val="swiss"/>
-    <w:pitch w:val="variable"/>
-    <w:sig w:usb0="00000287" w:usb1="00000000" w:usb2="00000000" w:usb3="00000000" w:csb0="0000009F" w:csb1="00000000"/>
-  </w:font>
-</w:fonts>
-</file>
-
-<file path=word/glossary/settings.xml><?xml version="1.0" encoding="utf-8"?>
-<w:settings xmlns:mc="http://schemas.openxmlformats.org/markup-compatibility/2006" xmlns:o="urn:schemas-microsoft-com:office:office" xmlns:r="http://schemas.openxmlformats.org/officeDocument/2006/relationships" xmlns:m="http://schemas.openxmlformats.org/officeDocument/2006/math" xmlns:v="urn:schemas-microsoft-com:vml" xmlns:w10="urn:schemas-microsoft-com:office:word" xmlns:w="http://schemas.openxmlformats.org/wordprocessingml/2006/main" xmlns:w14="http://schemas.microsoft.com/office/word/2010/wordml" xmlns:w15="http://schemas.microsoft.com/office/word/2012/wordml" xmlns:w16se="http://schemas.microsoft.com/office/word/2015/wordml/symex" xmlns:sl="http://schemas.openxmlformats.org/schemaLibrary/2006/main" mc:Ignorable="w14 w15 w16se">
-  <w:defaultTabStop w:val="708"/>
-  <w:hyphenationZone w:val="425"/>
-  <w:characterSpacingControl w:val="doNotCompress"/>
-  <w:compat>
-    <w:useFELayout/>
-    <w:compatSetting w:name="compatibilityMode" w:uri="http://schemas.microsoft.com/office/word" w:val="12"/>
-  </w:compat>
-  <w:rsids>
-    <w:rsidRoot w:val="008F14D6"/>
-    <w:rsid w:val="008F14D6"/>
-  </w:rsids>
-  <m:mathPr>
-    <m:mathFont m:val="Cambria Math"/>
-    <m:brkBin m:val="before"/>
-    <m:brkBinSub m:val="--"/>
-    <m:smallFrac m:val="0"/>
-    <m:dispDef/>
-    <m:lMargin m:val="0"/>
-    <m:rMargin m:val="0"/>
-    <m:defJc m:val="centerGroup"/>
-    <m:wrapIndent m:val="1440"/>
-    <m:intLim m:val="subSup"/>
-    <m:naryLim m:val="undOvr"/>
-  </m:mathPr>
-  <w:themeFontLang w:val="es-CL"/>
-  <w:clrSchemeMapping w:bg1="light1" w:t1="dark1" w:bg2="light2" w:t2="dark2" w:accent1="accent1" w:accent2="accent2" w:accent3="accent3" w:accent4="accent4" w:accent5="accent5" w:accent6="accent6" w:hyperlink="hyperlink" w:followedHyperlink="followedHyperlink"/>
-  <w:decimalSymbol w:val=","/>
-  <w:listSeparator w:val=";"/>
-</w:settings>
-</file>
-
-<file path=word/glossary/styles.xml><?xml version="1.0" encoding="utf-8"?>
-<w:styles xmlns:mc="http://schemas.openxmlformats.org/markup-compatibility/2006" xmlns:r="http://schemas.openxmlformats.org/officeDocument/2006/relationships" xmlns:w="http://schemas.openxmlformats.org/wordprocessingml/2006/main" xmlns:w14="http://schemas.microsoft.com/office/word/2010/wordml" xmlns:w15="http://schemas.microsoft.com/office/word/2012/wordml" xmlns:w16se="http://schemas.microsoft.com/office/word/2015/wordml/symex" mc:Ignorable="w14 w15 w16se">
-  <w:docDefaults>
-    <w:rPrDefault>
-      <w:rPr>
-        <w:rFonts w:asciiTheme="minorHAnsi" w:eastAsiaTheme="minorEastAsia" w:hAnsiTheme="minorHAnsi" w:cstheme="minorBidi"/>
-        <w:sz w:val="22"/>
-        <w:szCs w:val="22"/>
-        <w:lang w:val="es-CL" w:eastAsia="es-CL" w:bidi="ar-SA"/>
-      </w:rPr>
-    </w:rPrDefault>
-    <w:pPrDefault>
-      <w:pPr>
-        <w:spacing w:after="160" w:line="259" w:lineRule="auto"/>
-      </w:pPr>
-    </w:pPrDefault>
-  </w:docDefaults>
-  <w:latentStyles w:defLockedState="0" w:defUIPriority="99" w:defSemiHidden="0" w:defUnhideWhenUsed="0" w:defQFormat="0" w:count="371">
-    <w:lsdException w:name="Normal" w:uiPriority="0" w:qFormat="1"/>
-    <w:lsdException w:name="heading 1" w:uiPriority="9" w:qFormat="1"/>
-    <w:lsdException w:name="heading 2" w:semiHidden="1" w:uiPriority="9" w:unhideWhenUsed="1" w:qFormat="1"/>
-    <w:lsdException w:name="heading 3" w:semiHidden="1" w:uiPriority="9" w:unhideWhenUsed="1" w:qFormat="1"/>
-    <w:lsdException w:name="heading 4" w:semiHidden="1" w:uiPriority="9" w:unhideWhenUsed="1" w:qFormat="1"/>
-    <w:lsdException w:name="heading 5" w:semiHidden="1" w:uiPriority="9" w:unhideWhenUsed="1" w:qFormat="1"/>
-    <w:lsdException w:name="heading 6" w:semiHidden="1" w:uiPriority="9" w:unhideWhenUsed="1" w:qFormat="1"/>
-    <w:lsdException w:name="heading 7" w:semiHidden="1" w:uiPriority="9" w:unhideWhenUsed="1" w:qFormat="1"/>
-    <w:lsdException w:name="heading 8" w:semiHidden="1" w:uiPriority="9" w:unhideWhenUsed="1" w:qFormat="1"/>
-    <w:lsdException w:name="heading 9" w:semiHidden="1" w:uiPriority="9" w:unhideWhenUsed="1" w:qFormat="1"/>
-    <w:lsdException w:name="index 1" w:semiHidden="1" w:unhideWhenUsed="1"/>
-    <w:lsdException w:name="index 2" w:semiHidden="1" w:unhideWhenUsed="1"/>
-    <w:lsdException w:name="index 3" w:semiHidden="1" w:unhideWhenUsed="1"/>
-    <w:lsdException w:name="index 4" w:semiHidden="1" w:unhideWhenUsed="1"/>
-    <w:lsdException w:name="index 5" w:semiHidden="1" w:unhideWhenUsed="1"/>
-    <w:lsdException w:name="index 6" w:semiHidden="1" w:unhideWhenUsed="1"/>
-    <w:lsdException w:name="index 7" w:semiHidden="1" w:unhideWhenUsed="1"/>
-    <w:lsdException w:name="index 8" w:semiHidden="1" w:unhideWhenUsed="1"/>
-    <w:lsdException w:name="index 9" w:semiHidden="1" w:unhideWhenUsed="1"/>
-    <w:lsdException w:name="toc 1" w:semiHidden="1" w:uiPriority="39" w:unhideWhenUsed="1"/>
-    <w:lsdException w:name="toc 2" w:semiHidden="1" w:uiPriority="39" w:unhideWhenUsed="1"/>
-    <w:lsdException w:name="toc 3" w:semiHidden="1" w:uiPriority="39" w:unhideWhenUsed="1"/>
-    <w:lsdException w:name="toc 4" w:semiHidden="1" w:uiPriority="39" w:unhideWhenUsed="1"/>
-    <w:lsdException w:name="toc 5" w:semiHidden="1" w:uiPriority="39" w:unhideWhenUsed="1"/>
-    <w:lsdException w:name="toc 6" w:semiHidden="1" w:uiPriority="39" w:unhideWhenUsed="1"/>
-    <w:lsdException w:name="toc 7" w:semiHidden="1" w:uiPriority="39" w:unhideWhenUsed="1"/>
-    <w:lsdException w:name="toc 8" w:semiHidden="1" w:uiPriority="39" w:unhideWhenUsed="1"/>
-    <w:lsdException w:name="toc 9" w:semiHidden="1" w:uiPriority="39" w:unhideWhenUsed="1"/>
-    <w:lsdException w:name="Normal Indent" w:semiHidden="1" w:unhideWhenUsed="1"/>
-    <w:lsdException w:name="footnote text" w:semiHidden="1" w:unhideWhenUsed="1"/>
-    <w:lsdException w:name="annotation text" w:semiHidden="1" w:unhideWhenUsed="1"/>
-    <w:lsdException w:name="header" w:semiHidden="1" w:unhideWhenUsed="1"/>
-    <w:lsdException w:name="footer" w:semiHidden="1" w:unhideWhenUsed="1"/>
-    <w:lsdException w:name="index heading" w:semiHidden="1" w:unhideWhenUsed="1"/>
-    <w:lsdException w:name="caption" w:semiHidden="1" w:uiPriority="35" w:unhideWhenUsed="1" w:qFormat="1"/>
-    <w:lsdException w:name="table of figures" w:semiHidden="1" w:unhideWhenUsed="1"/>
-    <w:lsdException w:name="envelope address" w:semiHidden="1" w:unhideWhenUsed="1"/>
-    <w:lsdException w:name="envelope return" w:semiHidden="1" w:unhideWhenUsed="1"/>
-    <w:lsdException w:name="footnote reference" w:semiHidden="1" w:unhideWhenUsed="1"/>
-    <w:lsdException w:name="annotation reference" w:semiHidden="1" w:unhideWhenUsed="1"/>
-    <w:lsdException w:name="line number" w:semiHidden="1" w:unhideWhenUsed="1"/>
-    <w:lsdException w:name="page number" w:semiHidden="1" w:unhideWhenUsed="1"/>
-    <w:lsdException w:name="endnote reference" w:semiHidden="1" w:unhideWhenUsed="1"/>
-    <w:lsdException w:name="endnote text" w:semiHidden="1" w:unhideWhenUsed="1"/>
-    <w:lsdException w:name="table of authorities" w:semiHidden="1" w:unhideWhenUsed="1"/>
-    <w:lsdException w:name="macro" w:semiHidden="1" w:unhideWhenUsed="1"/>
-    <w:lsdException w:name="toa heading" w:semiHidden="1" w:unhideWhenUsed="1"/>
-    <w:lsdException w:name="List" w:semiHidden="1" w:unhideWhenUsed="1"/>
-    <w:lsdException w:name="List Bullet" w:semiHidden="1" w:unhideWhenUsed="1"/>
-    <w:lsdException w:name="List Number" w:semiHidden="1" w:unhideWhenUsed="1"/>
-    <w:lsdException w:name="List 2" w:semiHidden="1" w:unhideWhenUsed="1"/>
-    <w:lsdException w:name="List 3" w:semiHidden="1" w:unhideWhenUsed="1"/>
-    <w:lsdException w:name="List 4" w:semiHidden="1" w:unhideWhenUsed="1"/>
-    <w:lsdException w:name="List 5" w:semiHidden="1" w:unhideWhenUsed="1"/>
-    <w:lsdException w:name="List Bullet 2" w:semiHidden="1" w:unhideWhenUsed="1"/>
-    <w:lsdException w:name="List Bullet 3" w:semiHidden="1" w:unhideWhenUsed="1"/>
-    <w:lsdException w:name="List Bullet 4" w:semiHidden="1" w:unhideWhenUsed="1"/>
-    <w:lsdException w:name="List Bullet 5" w:semiHidden="1" w:unhideWhenUsed="1"/>
-    <w:lsdException w:name="List Number 2" w:semiHidden="1" w:unhideWhenUsed="1"/>
-    <w:lsdException w:name="List Number 3" w:semiHidden="1" w:unhideWhenUsed="1"/>
-    <w:lsdException w:name="List Number 4" w:semiHidden="1" w:unhideWhenUsed="1"/>
-    <w:lsdException w:name="List Number 5" w:semiHidden="1" w:unhideWhenUsed="1"/>
-    <w:lsdException w:name="Title" w:uiPriority="10" w:qFormat="1"/>
-    <w:lsdException w:name="Closing" w:semiHidden="1" w:unhideWhenUsed="1"/>
-    <w:lsdException w:name="Signature" w:semiHidden="1" w:unhideWhenUsed="1"/>
-    <w:lsdException w:name="Default Paragraph Font" w:semiHidden="1" w:uiPriority="1" w:unhideWhenUsed="1"/>
-    <w:lsdException w:name="Body Text" w:semiHidden="1" w:unhideWhenUsed="1"/>
-    <w:lsdException w:name="Body Text Indent" w:semiHidden="1" w:unhideWhenUsed="1"/>
-    <w:lsdException w:name="List Continue" w:semiHidden="1" w:unhideWhenUsed="1"/>
-    <w:lsdException w:name="List Continue 2" w:semiHidden="1" w:unhideWhenUsed="1"/>
-    <w:lsdException w:name="List Continue 3" w:semiHidden="1" w:unhideWhenUsed="1"/>
-    <w:lsdException w:name="List Continue 4" w:semiHidden="1" w:unhideWhenUsed="1"/>
-    <w:lsdException w:name="List Continue 5" w:semiHidden="1" w:unhideWhenUsed="1"/>
-    <w:lsdException w:name="Message Header" w:semiHidden="1" w:unhideWhenUsed="1"/>
-    <w:lsdException w:name="Subtitle" w:uiPriority="11" w:qFormat="1"/>
-    <w:lsdException w:name="Salutation" w:semiHidden="1" w:unhideWhenUsed="1"/>
-    <w:lsdException w:name="Date" w:semiHidden="1" w:unhideWhenUsed="1"/>
-    <w:lsdException w:name="Body Text First Indent" w:semiHidden="1" w:unhideWhenUsed="1"/>
-    <w:lsdException w:name="Body Text First Indent 2" w:semiHidden="1" w:unhideWhenUsed="1"/>
-    <w:lsdException w:name="Note Heading" w:semiHidden="1" w:unhideWhenUsed="1"/>
-    <w:lsdException w:name="Body Text 2" w:semiHidden="1" w:unhideWhenUsed="1"/>
-    <w:lsdException w:name="Body Text 3" w:semiHidden="1" w:unhideWhenUsed="1"/>
-    <w:lsdException w:name="Body Text Indent 2" w:semiHidden="1" w:unhideWhenUsed="1"/>
-    <w:lsdException w:name="Body Text Indent 3" w:semiHidden="1" w:unhideWhenUsed="1"/>
-    <w:lsdException w:name="Block Text" w:semiHidden="1" w:unhideWhenUsed="1"/>
-    <w:lsdException w:name="Hyperlink" w:semiHidden="1" w:unhideWhenUsed="1"/>
-    <w:lsdException w:name="FollowedHyperlink" w:semiHidden="1" w:unhideWhenUsed="1"/>
-    <w:lsdException w:name="Strong" w:uiPriority="22" w:qFormat="1"/>
-    <w:lsdException w:name="Emphasis" w:uiPriority="20" w:qFormat="1"/>
-    <w:lsdException w:name="Document Map" w:semiHidden="1" w:unhideWhenUsed="1"/>
-    <w:lsdException w:name="Plain Text" w:semiHidden="1" w:unhideWhenUsed="1"/>
-    <w:lsdException w:name="E-mail Signature" w:semiHidden="1" w:unhideWhenUsed="1"/>
-    <w:lsdException w:name="HTML Top of Form" w:semiHidden="1" w:unhideWhenUsed="1"/>
-    <w:lsdException w:name="HTML Bottom of Form" w:semiHidden="1" w:unhideWhenUsed="1"/>
-    <w:lsdException w:name="Normal (Web)" w:semiHidden="1" w:unhideWhenUsed="1"/>
-    <w:lsdException w:name="HTML Acronym" w:semiHidden="1" w:unhideWhenUsed="1"/>
-    <w:lsdException w:name="HTML Address" w:semiHidden="1" w:unhideWhenUsed="1"/>
-    <w:lsdException w:name="HTML Cite" w:semiHidden="1" w:unhideWhenUsed="1"/>
-    <w:lsdException w:name="HTML Code" w:semiHidden="1" w:unhideWhenUsed="1"/>
-    <w:lsdException w:name="HTML Definition" w:semiHidden="1" w:unhideWhenUsed="1"/>
-    <w:lsdException w:name="HTML Keyboard" w:semiHidden="1" w:unhideWhenUsed="1"/>
-    <w:lsdException w:name="HTML Preformatted" w:semiHidden="1" w:unhideWhenUsed="1"/>
-    <w:lsdException w:name="HTML Sample" w:semiHidden="1" w:unhideWhenUsed="1"/>
-    <w:lsdException w:name="HTML Typewriter" w:semiHidden="1" w:unhideWhenUsed="1"/>
-    <w:lsdException w:name="HTML Variable" w:semiHidden="1" w:unhideWhenUsed="1"/>
-    <w:lsdException w:name="Normal Table" w:semiHidden="1" w:unhideWhenUsed="1"/>
-    <w:lsdException w:name="annotation subject" w:semiHidden="1" w:unhideWhenUsed="1"/>
-    <w:lsdException w:name="No List" w:semiHidden="1" w:unhideWhenUsed="1"/>
-    <w:lsdException w:name="Outline List 1" w:semiHidden="1" w:unhideWhenUsed="1"/>
-    <w:lsdException w:name="Outline List 2" w:semiHidden="1" w:unhideWhenUsed="1"/>
-    <w:lsdException w:name="Outline List 3" w:semiHidden="1" w:unhideWhenUsed="1"/>
-    <w:lsdException w:name="Table Simple 1" w:semiHidden="1" w:unhideWhenUsed="1"/>
-    <w:lsdException w:name="Table Simple 2" w:semiHidden="1" w:unhideWhenUsed="1"/>
-    <w:lsdException w:name="Table Simple 3" w:semiHidden="1" w:unhideWhenUsed="1"/>
-    <w:lsdException w:name="Table Classic 1" w:semiHidden="1" w:unhideWhenUsed="1"/>
-    <w:lsdException w:name="Table Classic 2" w:semiHidden="1" w:unhideWhenUsed="1"/>
-    <w:lsdException w:name="Table Classic 3" w:semiHidden="1" w:unhideWhenUsed="1"/>
-    <w:lsdException w:name="Table Classic 4" w:semiHidden="1" w:unhideWhenUsed="1"/>
-    <w:lsdException w:name="Table Colorful 1" w:semiHidden="1" w:unhideWhenUsed="1"/>
-    <w:lsdException w:name="Table Colorful 2" w:semiHidden="1" w:unhideWhenUsed="1"/>
-    <w:lsdException w:name="Table Colorful 3" w:semiHidden="1" w:unhideWhenUsed="1"/>
-    <w:lsdException w:name="Table Columns 1" w:semiHidden="1" w:unhideWhenUsed="1"/>
-    <w:lsdException w:name="Table Columns 2" w:semiHidden="1" w:unhideWhenUsed="1"/>
-    <w:lsdException w:name="Table Columns 3" w:semiHidden="1" w:unhideWhenUsed="1"/>
-    <w:lsdException w:name="Table Columns 4" w:semiHidden="1" w:unhideWhenUsed="1"/>
-    <w:lsdException w:name="Table Columns 5" w:semiHidden="1" w:unhideWhenUsed="1"/>
-    <w:lsdException w:name="Table Grid 1" w:semiHidden="1" w:unhideWhenUsed="1"/>
-    <w:lsdException w:name="Table Grid 2" w:semiHidden="1" w:unhideWhenUsed="1"/>
-    <w:lsdException w:name="Table Grid 3" w:semiHidden="1" w:unhideWhenUsed="1"/>
-    <w:lsdException w:name="Table Grid 4" w:semiHidden="1" w:unhideWhenUsed="1"/>
-    <w:lsdException w:name="Table Grid 5" w:semiHidden="1" w:unhideWhenUsed="1"/>
-    <w:lsdException w:name="Table Grid 6" w:semiHidden="1" w:unhideWhenUsed="1"/>
-    <w:lsdException w:name="Table Grid 7" w:semiHidden="1" w:unhideWhenUsed="1"/>
-    <w:lsdException w:name="Table Grid 8" w:semiHidden="1" w:unhideWhenUsed="1"/>
-    <w:lsdException w:name="Table List 1" w:semiHidden="1" w:unhideWhenUsed="1"/>
-    <w:lsdException w:name="Table List 2" w:semiHidden="1" w:unhideWhenUsed="1"/>
-    <w:lsdException w:name="Table List 3" w:semiHidden="1" w:unhideWhenUsed="1"/>
-    <w:lsdException w:name="Table List 4" w:semiHidden="1" w:unhideWhenUsed="1"/>
-    <w:lsdException w:name="Table List 5" w:semiHidden="1" w:unhideWhenUsed="1"/>
-    <w:lsdException w:name="Table List 6" w:semiHidden="1" w:unhideWhenUsed="1"/>
-    <w:lsdException w:name="Table List 7" w:semiHidden="1" w:unhideWhenUsed="1"/>
-    <w:lsdException w:name="Table List 8" w:semiHidden="1" w:unhideWhenUsed="1"/>
-    <w:lsdException w:name="Table 3D effects 1" w:semiHidden="1" w:unhideWhenUsed="1"/>
-    <w:lsdException w:name="Table 3D effects 2" w:semiHidden="1" w:unhideWhenUsed="1"/>
-    <w:lsdException w:name="Table 3D effects 3" w:semiHidden="1" w:unhideWhenUsed="1"/>
-    <w:lsdException w:name="Table Contemporary" w:semiHidden="1" w:unhideWhenUsed="1"/>
-    <w:lsdException w:name="Table Elegant" w:semiHidden="1" w:unhideWhenUsed="1"/>
-    <w:lsdException w:name="Table Professional" w:semiHidden="1" w:unhideWhenUsed="1"/>
-    <w:lsdException w:name="Table Subtle 1" w:semiHidden="1" w:unhideWhenUsed="1"/>
-    <w:lsdException w:name="Table Subtle 2" w:semiHidden="1" w:unhideWhenUsed="1"/>
-    <w:lsdException w:name="Table Web 1" w:semiHidden="1" w:unhideWhenUsed="1"/>
-    <w:lsdException w:name="Table Web 2" w:semiHidden="1" w:unhideWhenUsed="1"/>
-    <w:lsdException w:name="Table Web 3" w:semiHidden="1" w:unhideWhenUsed="1"/>
-    <w:lsdException w:name="Balloon Text" w:semiHidden="1" w:unhideWhenUsed="1"/>
-    <w:lsdException w:name="Table Grid" w:uiPriority="39"/>
-    <w:lsdException w:name="Table Theme" w:semiHidden="1" w:unhideWhenUsed="1"/>
-    <w:lsdException w:name="Placeholder Text" w:semiHidden="1"/>
-    <w:lsdException w:name="No Spacing" w:uiPriority="1" w:qFormat="1"/>
-    <w:lsdException w:name="Light Shading" w:uiPriority="60"/>
-    <w:lsdException w:name="Light List" w:uiPriority="61"/>
-    <w:lsdException w:name="Light Grid" w:uiPriority="62"/>
-    <w:lsdException w:name="Medium Shading 1" w:uiPriority="63"/>
-    <w:lsdException w:name="Medium Shading 2" w:uiPriority="64"/>
-    <w:lsdException w:name="Medium List 1" w:uiPriority="65"/>
-    <w:lsdException w:name="Medium List 2" w:uiPriority="66"/>
-    <w:lsdException w:name="Medium Grid 1" w:uiPriority="67"/>
-    <w:lsdException w:name="Medium Grid 2" w:uiPriority="68"/>
-    <w:lsdException w:name="Medium Grid 3" w:uiPriority="69"/>
-    <w:lsdException w:name="Dark List" w:uiPriority="70"/>
-    <w:lsdException w:name="Colorful Shading" w:uiPriority="71"/>
-    <w:lsdException w:name="Colorful List" w:uiPriority="72"/>
-    <w:lsdException w:name="Colorful Grid" w:uiPriority="73"/>
-    <w:lsdException w:name="Light Shading Accent 1" w:uiPriority="60"/>
-    <w:lsdException w:name="Light List Accent 1" w:uiPriority="61"/>
-    <w:lsdException w:name="Light Grid Accent 1" w:uiPriority="62"/>
-    <w:lsdException w:name="Medium Shading 1 Accent 1" w:uiPriority="63"/>
-    <w:lsdException w:name="Medium Shading 2 Accent 1" w:uiPriority="64"/>
-    <w:lsdException w:name="Medium List 1 Accent 1" w:uiPriority="65"/>
-    <w:lsdException w:name="Revision" w:semiHidden="1"/>
-    <w:lsdException w:name="List Paragraph" w:uiPriority="34" w:qFormat="1"/>
-    <w:lsdException w:name="Quote" w:uiPriority="29" w:qFormat="1"/>
-    <w:lsdException w:name="Intense Quote" w:uiPriority="30" w:qFormat="1"/>
-    <w:lsdException w:name="Medium List 2 Accent 1" w:uiPriority="66"/>
-    <w:lsdException w:name="Medium Grid 1 Accent 1" w:uiPriority="67"/>
-    <w:lsdException w:name="Medium Grid 2 Accent 1" w:uiPriority="68"/>
-    <w:lsdException w:name="Medium Grid 3 Accent 1" w:uiPriority="69"/>
-    <w:lsdException w:name="Dark List Accent 1" w:uiPriority="70"/>
-    <w:lsdException w:name="Colorful Shading Accent 1" w:uiPriority="71"/>
-    <w:lsdException w:name="Colorful List Accent 1" w:uiPriority="72"/>
-    <w:lsdException w:name="Colorful Grid Accent 1" w:uiPriority="73"/>
-    <w:lsdException w:name="Light Shading Accent 2" w:uiPriority="60"/>
-    <w:lsdException w:name="Light List Accent 2" w:uiPriority="61"/>
-    <w:lsdException w:name="Light Grid Accent 2" w:uiPriority="62"/>
-    <w:lsdException w:name="Medium Shading 1 Accent 2" w:uiPriority="63"/>
-    <w:lsdException w:name="Medium Shading 2 Accent 2" w:uiPriority="64"/>
-    <w:lsdException w:name="Medium List 1 Accent 2" w:uiPriority="65"/>
-    <w:lsdException w:name="Medium List 2 Accent 2" w:uiPriority="66"/>
-    <w:lsdException w:name="Medium Grid 1 Accent 2" w:uiPriority="67"/>
-    <w:lsdException w:name="Medium Grid 2 Accent 2" w:uiPriority="68"/>
-    <w:lsdException w:name="Medium Grid 3 Accent 2" w:uiPriority="69"/>
-    <w:lsdException w:name="Dark List Accent 2" w:uiPriority="70"/>
-    <w:lsdException w:name="Colorful Shading Accent 2" w:uiPriority="71"/>
-    <w:lsdException w:name="Colorful List Accent 2" w:uiPriority="72"/>
-    <w:lsdException w:name="Colorful Grid Accent 2" w:uiPriority="73"/>
-    <w:lsdException w:name="Light Shading Accent 3" w:uiPriority="60"/>
-    <w:lsdException w:name="Light List Accent 3" w:uiPriority="61"/>
-    <w:lsdException w:name="Light Grid Accent 3" w:uiPriority="62"/>
-    <w:lsdException w:name="Medium Shading 1 Accent 3" w:uiPriority="63"/>
-    <w:lsdException w:name="Medium Shading 2 Accent 3" w:uiPriority="64"/>
-    <w:lsdException w:name="Medium List 1 Accent 3" w:uiPriority="65"/>
-    <w:lsdException w:name="Medium List 2 Accent 3" w:uiPriority="66"/>
-    <w:lsdException w:name="Medium Grid 1 Accent 3" w:uiPriority="67"/>
-    <w:lsdException w:name="Medium Grid 2 Accent 3" w:uiPriority="68"/>
-    <w:lsdException w:name="Medium Grid 3 Accent 3" w:uiPriority="69"/>
-    <w:lsdException w:name="Dark List Accent 3" w:uiPriority="70"/>
-    <w:lsdException w:name="Colorful Shading Accent 3" w:uiPriority="71"/>
-    <w:lsdException w:name="Colorful List Accent 3" w:uiPriority="72"/>
-    <w:lsdException w:name="Colorful Grid Accent 3" w:uiPriority="73"/>
-    <w:lsdException w:name="Light Shading Accent 4" w:uiPriority="60"/>
-    <w:lsdException w:name="Light List Accent 4" w:uiPriority="61"/>
-    <w:lsdException w:name="Light Grid Accent 4" w:uiPriority="62"/>
-    <w:lsdException w:name="Medium Shading 1 Accent 4" w:uiPriority="63"/>
-    <w:lsdException w:name="Medium Shading 2 Accent 4" w:uiPriority="64"/>
-    <w:lsdException w:name="Medium List 1 Accent 4" w:uiPriority="65"/>
-    <w:lsdException w:name="Medium List 2 Accent 4" w:uiPriority="66"/>
-    <w:lsdException w:name="Medium Grid 1 Accent 4" w:uiPriority="67"/>
-    <w:lsdException w:name="Medium Grid 2 Accent 4" w:uiPriority="68"/>
-    <w:lsdException w:name="Medium Grid 3 Accent 4" w:uiPriority="69"/>
-    <w:lsdException w:name="Dark List Accent 4" w:uiPriority="70"/>
-    <w:lsdException w:name="Colorful Shading Accent 4" w:uiPriority="71"/>
-    <w:lsdException w:name="Colorful List Accent 4" w:uiPriority="72"/>
-    <w:lsdException w:name="Colorful Grid Accent 4" w:uiPriority="73"/>
-    <w:lsdException w:name="Light Shading Accent 5" w:uiPriority="60"/>
-    <w:lsdException w:name="Light List Accent 5" w:uiPriority="61"/>
-    <w:lsdException w:name="Light Grid Accent 5" w:uiPriority="62"/>
-    <w:lsdException w:name="Medium Shading 1 Accent 5" w:uiPriority="63"/>
-    <w:lsdException w:name="Medium Shading 2 Accent 5" w:uiPriority="64"/>
-    <w:lsdException w:name="Medium List 1 Accent 5" w:uiPriority="65"/>
-    <w:lsdException w:name="Medium List 2 Accent 5" w:uiPriority="66"/>
-    <w:lsdException w:name="Medium Grid 1 Accent 5" w:uiPriority="67"/>
-    <w:lsdException w:name="Medium Grid 2 Accent 5" w:uiPriority="68"/>
-    <w:lsdException w:name="Medium Grid 3 Accent 5" w:uiPriority="69"/>
-    <w:lsdException w:name="Dark List Accent 5" w:uiPriority="70"/>
-    <w:lsdException w:name="Colorful Shading Accent 5" w:uiPriority="71"/>
-    <w:lsdException w:name="Colorful List Accent 5" w:uiPriority="72"/>
-    <w:lsdException w:name="Colorful Grid Accent 5" w:uiPriority="73"/>
-    <w:lsdException w:name="Light Shading Accent 6" w:uiPriority="60"/>
-    <w:lsdException w:name="Light List Accent 6" w:uiPriority="61"/>
-    <w:lsdException w:name="Light Grid Accent 6" w:uiPriority="62"/>
-    <w:lsdException w:name="Medium Shading 1 Accent 6" w:uiPriority="63"/>
-    <w:lsdException w:name="Medium Shading 2 Accent 6" w:uiPriority="64"/>
-    <w:lsdException w:name="Medium List 1 Accent 6" w:uiPriority="65"/>
-    <w:lsdException w:name="Medium List 2 Accent 6" w:uiPriority="66"/>
-    <w:lsdException w:name="Medium Grid 1 Accent 6" w:uiPriority="67"/>
-    <w:lsdException w:name="Medium Grid 2 Accent 6" w:uiPriority="68"/>
-    <w:lsdException w:name="Medium Grid 3 Accent 6" w:uiPriority="69"/>
-    <w:lsdException w:name="Dark List Accent 6" w:uiPriority="70"/>
-    <w:lsdException w:name="Colorful Shading Accent 6" w:uiPriority="71"/>
-    <w:lsdException w:name="Colorful List Accent 6" w:uiPriority="72"/>
-    <w:lsdException w:name="Colorful Grid Accent 6" w:uiPriority="73"/>
-    <w:lsdException w:name="Subtle Emphasis" w:uiPriority="19" w:qFormat="1"/>
-    <w:lsdException w:name="Intense Emphasis" w:uiPriority="21" w:qFormat="1"/>
-    <w:lsdException w:name="Subtle Reference" w:uiPriority="31" w:qFormat="1"/>
-    <w:lsdException w:name="Intense Reference" w:uiPriority="32" w:qFormat="1"/>
-    <w:lsdException w:name="Book Title" w:uiPriority="33" w:qFormat="1"/>
-    <w:lsdException w:name="Bibliography" w:semiHidden="1" w:uiPriority="37" w:unhideWhenUsed="1"/>
-    <w:lsdException w:name="TOC Heading" w:semiHidden="1" w:uiPriority="39" w:unhideWhenUsed="1" w:qFormat="1"/>
-    <w:lsdException w:name="Plain Table 1" w:uiPriority="41"/>
-    <w:lsdException w:name="Plain Table 2" w:uiPriority="42"/>
-    <w:lsdException w:name="Plain Table 3" w:uiPriority="43"/>
-    <w:lsdException w:name="Plain Table 4" w:uiPriority="44"/>
-    <w:lsdException w:name="Plain Table 5" w:uiPriority="45"/>
-    <w:lsdException w:name="Grid Table Light" w:uiPriority="40"/>
-    <w:lsdException w:name="Grid Table 1 Light" w:uiPriority="46"/>
-    <w:lsdException w:name="Grid Table 2" w:uiPriority="47"/>
-    <w:lsdException w:name="Grid Table 3" w:uiPriority="48"/>
-    <w:lsdException w:name="Grid Table 4" w:uiPriority="49"/>
-    <w:lsdException w:name="Grid Table 5 Dark" w:uiPriority="50"/>
-    <w:lsdException w:name="Grid Table 6 Colorful" w:uiPriority="51"/>
-    <w:lsdException w:name="Grid Table 7 Colorful" w:uiPriority="52"/>
-    <w:lsdException w:name="Grid Table 1 Light Accent 1" w:uiPriority="46"/>
-    <w:lsdException w:name="Grid Table 2 Accent 1" w:uiPriority="47"/>
-    <w:lsdException w:name="Grid Table 3 Accent 1" w:uiPriority="48"/>
-    <w:lsdException w:name="Grid Table 4 Accent 1" w:uiPriority="49"/>
-    <w:lsdException w:name="Grid Table 5 Dark Accent 1" w:uiPriority="50"/>
-    <w:lsdException w:name="Grid Table 6 Colorful Accent 1" w:uiPriority="51"/>
-    <w:lsdException w:name="Grid Table 7 Colorful Accent 1" w:uiPriority="52"/>
-    <w:lsdException w:name="Grid Table 1 Light Accent 2" w:uiPriority="46"/>
-    <w:lsdException w:name="Grid Table 2 Accent 2" w:uiPriority="47"/>
-    <w:lsdException w:name="Grid Table 3 Accent 2" w:uiPriority="48"/>
-    <w:lsdException w:name="Grid Table 4 Accent 2" w:uiPriority="49"/>
-    <w:lsdException w:name="Grid Table 5 Dark Accent 2" w:uiPriority="50"/>
-    <w:lsdException w:name="Grid Table 6 Colorful Accent 2" w:uiPriority="51"/>
-    <w:lsdException w:name="Grid Table 7 Colorful Accent 2" w:uiPriority="52"/>
-    <w:lsdException w:name="Grid Table 1 Light Accent 3" w:uiPriority="46"/>
-    <w:lsdException w:name="Grid Table 2 Accent 3" w:uiPriority="47"/>
-    <w:lsdException w:name="Grid Table 3 Accent 3" w:uiPriority="48"/>
-    <w:lsdException w:name="Grid Table 4 Accent 3" w:uiPriority="49"/>
-    <w:lsdException w:name="Grid Table 5 Dark Accent 3" w:uiPriority="50"/>
-    <w:lsdException w:name="Grid Table 6 Colorful Accent 3" w:uiPriority="51"/>
-    <w:lsdException w:name="Grid Table 7 Colorful Accent 3" w:uiPriority="52"/>
-    <w:lsdException w:name="Grid Table 1 Light Accent 4" w:uiPriority="46"/>
-    <w:lsdException w:name="Grid Table 2 Accent 4" w:uiPriority="47"/>
-    <w:lsdException w:name="Grid Table 3 Accent 4" w:uiPriority="48"/>
-    <w:lsdException w:name="Grid Table 4 Accent 4" w:uiPriority="49"/>
-    <w:lsdException w:name="Grid Table 5 Dark Accent 4" w:uiPriority="50"/>
-    <w:lsdException w:name="Grid Table 6 Colorful Accent 4" w:uiPriority="51"/>
-    <w:lsdException w:name="Grid Table 7 Colorful Accent 4" w:uiPriority="52"/>
-    <w:lsdException w:name="Grid Table 1 Light Accent 5" w:uiPriority="46"/>
-    <w:lsdException w:name="Grid Table 2 Accent 5" w:uiPriority="47"/>
-    <w:lsdException w:name="Grid Table 3 Accent 5" w:uiPriority="48"/>
-    <w:lsdException w:name="Grid Table 4 Accent 5" w:uiPriority="49"/>
-    <w:lsdException w:name="Grid Table 5 Dark Accent 5" w:uiPriority="50"/>
-    <w:lsdException w:name="Grid Table 6 Colorful Accent 5" w:uiPriority="51"/>
-    <w:lsdException w:name="Grid Table 7 Colorful Accent 5" w:uiPriority="52"/>
-    <w:lsdException w:name="Grid Table 1 Light Accent 6" w:uiPriority="46"/>
-    <w:lsdException w:name="Grid Table 2 Accent 6" w:uiPriority="47"/>
-    <w:lsdException w:name="Grid Table 3 Accent 6" w:uiPriority="48"/>
-    <w:lsdException w:name="Grid Table 4 Accent 6" w:uiPriority="49"/>
-    <w:lsdException w:name="Grid Table 5 Dark Accent 6" w:uiPriority="50"/>
-    <w:lsdException w:name="Grid Table 6 Colorful Accent 6" w:uiPriority="51"/>
-    <w:lsdException w:name="Grid Table 7 Colorful Accent 6" w:uiPriority="52"/>
-    <w:lsdException w:name="List Table 1 Light" w:uiPriority="46"/>
-    <w:lsdException w:name="List Table 2" w:uiPriority="47"/>
-    <w:lsdException w:name="List Table 3" w:uiPriority="48"/>
-    <w:lsdException w:name="List Table 4" w:uiPriority="49"/>
-    <w:lsdException w:name="List Table 5 Dark" w:uiPriority="50"/>
-    <w:lsdException w:name="List Table 6 Colorful" w:uiPriority="51"/>
-    <w:lsdException w:name="List Table 7 Colorful" w:uiPriority="52"/>
-    <w:lsdException w:name="List Table 1 Light Accent 1" w:uiPriority="46"/>
-    <w:lsdException w:name="List Table 2 Accent 1" w:uiPriority="47"/>
-    <w:lsdException w:name="List Table 3 Accent 1" w:uiPriority="48"/>
-    <w:lsdException w:name="List Table 4 Accent 1" w:uiPriority="49"/>
-    <w:lsdException w:name="List Table 5 Dark Accent 1" w:uiPriority="50"/>
-    <w:lsdException w:name="List Table 6 Colorful Accent 1" w:uiPriority="51"/>
-    <w:lsdException w:name="List Table 7 Colorful Accent 1" w:uiPriority="52"/>
-    <w:lsdException w:name="List Table 1 Light Accent 2" w:uiPriority="46"/>
-    <w:lsdException w:name="List Table 2 Accent 2" w:uiPriority="47"/>
-    <w:lsdException w:name="List Table 3 Accent 2" w:uiPriority="48"/>
-    <w:lsdException w:name="List Table 4 Accent 2" w:uiPriority="49"/>
-    <w:lsdException w:name="List Table 5 Dark Accent 2" w:uiPriority="50"/>
-    <w:lsdException w:name="List Table 6 Colorful Accent 2" w:uiPriority="51"/>
-    <w:lsdException w:name="List Table 7 Colorful Accent 2" w:uiPriority="52"/>
-    <w:lsdException w:name="List Table 1 Light Accent 3" w:uiPriority="46"/>
-    <w:lsdException w:name="List Table 2 Accent 3" w:uiPriority="47"/>
-    <w:lsdException w:name="List Table 3 Accent 3" w:uiPriority="48"/>
-    <w:lsdException w:name="List Table 4 Accent 3" w:uiPriority="49"/>
-    <w:lsdException w:name="List Table 5 Dark Accent 3" w:uiPriority="50"/>
-    <w:lsdException w:name="List Table 6 Colorful Accent 3" w:uiPriority="51"/>
-    <w:lsdException w:name="List Table 7 Colorful Accent 3" w:uiPriority="52"/>
-    <w:lsdException w:name="List Table 1 Light Accent 4" w:uiPriority="46"/>
-    <w:lsdException w:name="List Table 2 Accent 4" w:uiPriority="47"/>
-    <w:lsdException w:name="List Table 3 Accent 4" w:uiPriority="48"/>
-    <w:lsdException w:name="List Table 4 Accent 4" w:uiPriority="49"/>
-    <w:lsdException w:name="List Table 5 Dark Accent 4" w:uiPriority="50"/>
-    <w:lsdException w:name="List Table 6 Colorful Accent 4" w:uiPriority="51"/>
-    <w:lsdException w:name="List Table 7 Colorful Accent 4" w:uiPriority="52"/>
-    <w:lsdException w:name="List Table 1 Light Accent 5" w:uiPriority="46"/>
-    <w:lsdException w:name="List Table 2 Accent 5" w:uiPriority="47"/>
-    <w:lsdException w:name="List Table 3 Accent 5" w:uiPriority="48"/>
-    <w:lsdException w:name="List Table 4 Accent 5" w:uiPriority="49"/>
-    <w:lsdException w:name="List Table 5 Dark Accent 5" w:uiPriority="50"/>
-    <w:lsdException w:name="List Table 6 Colorful Accent 5" w:uiPriority="51"/>
-    <w:lsdException w:name="List Table 7 Colorful Accent 5" w:uiPriority="52"/>
-    <w:lsdException w:name="List Table 1 Light Accent 6" w:uiPriority="46"/>
-    <w:lsdException w:name="List Table 2 Accent 6" w:uiPriority="47"/>
-    <w:lsdException w:name="List Table 3 Accent 6" w:uiPriority="48"/>
-    <w:lsdException w:name="List Table 4 Accent 6" w:uiPriority="49"/>
-    <w:lsdException w:name="List Table 5 Dark Accent 6" w:uiPriority="50"/>
-    <w:lsdException w:name="List Table 6 Colorful Accent 6" w:uiPriority="51"/>
-    <w:lsdException w:name="List Table 7 Colorful Accent 6" w:uiPriority="52"/>
-  </w:latentStyles>
-  <w:style w:type="paragraph" w:default="1" w:styleId="Normal">
-    <w:name w:val="Normal"/>
-    <w:qFormat/>
-  </w:style>
-  <w:style w:type="character" w:default="1" w:styleId="Fuentedeprrafopredeter">
-    <w:name w:val="Default Paragraph Font"/>
-    <w:uiPriority w:val="1"/>
-    <w:semiHidden/>
-    <w:unhideWhenUsed/>
-  </w:style>
-  <w:style w:type="table" w:default="1" w:styleId="Tablanormal">
-    <w:name w:val="Normal Table"/>
-    <w:uiPriority w:val="99"/>
-    <w:semiHidden/>
-    <w:unhideWhenUsed/>
-    <w:tblPr>
-      <w:tblInd w:w="0" w:type="dxa"/>
-      <w:tblCellMar>
-        <w:top w:w="0" w:type="dxa"/>
-        <w:left w:w="108" w:type="dxa"/>
-        <w:bottom w:w="0" w:type="dxa"/>
-        <w:right w:w="108" w:type="dxa"/>
-      </w:tblCellMar>
-    </w:tblPr>
-  </w:style>
-  <w:style w:type="numbering" w:default="1" w:styleId="Sinlista">
-    <w:name w:val="No List"/>
-    <w:uiPriority w:val="99"/>
-    <w:semiHidden/>
-    <w:unhideWhenUsed/>
-  </w:style>
-</w:styles>
-</file>
-
-<file path=word/glossary/webSettings.xml><?xml version="1.0" encoding="utf-8"?>
-<w:webSettings xmlns:mc="http://schemas.openxmlformats.org/markup-compatibility/2006" xmlns:r="http://schemas.openxmlformats.org/officeDocument/2006/relationships" xmlns:w="http://schemas.openxmlformats.org/wordprocessingml/2006/main" xmlns:w14="http://schemas.microsoft.com/office/word/2010/wordml" xmlns:w15="http://schemas.microsoft.com/office/word/2012/wordml" xmlns:w16se="http://schemas.microsoft.com/office/word/2015/wordml/symex" mc:Ignorable="w14 w15 w16se"/>
 </file>
 
 <file path=word/theme/theme1.xml><?xml version="1.0" encoding="utf-8"?>
@@ -9000,6 +8818,25 @@
 </file>
 
 <file path=customXml/item1.xml><?xml version="1.0" encoding="utf-8"?>
+<b:Sources xmlns:b="http://schemas.openxmlformats.org/officeDocument/2006/bibliography" xmlns="http://schemas.openxmlformats.org/officeDocument/2006/bibliography" SelectedStyle="\APASixthEditionOfficeOnline.xsl" StyleName="APA" Version="6"/>
+</file>
+
+<file path=customXml/item2.xml><?xml version="1.0" encoding="utf-8"?>
+<?mso-contentType ?>
+<FormTemplates xmlns="http://schemas.microsoft.com/sharepoint/v3/contenttype/forms">
+  <Display>DocumentLibraryForm</Display>
+  <Edit>DocumentLibraryForm</Edit>
+  <New>DocumentLibraryForm</New>
+</FormTemplates>
+</file>
+
+<file path=customXml/item3.xml><?xml version="1.0" encoding="utf-8"?>
+<p:properties xmlns:p="http://schemas.microsoft.com/office/2006/metadata/properties" xmlns:xsi="http://www.w3.org/2001/XMLSchema-instance" xmlns:pc="http://schemas.microsoft.com/office/infopath/2007/PartnerControls">
+  <documentManagement/>
+</p:properties>
+</file>
+
+<file path=customXml/item4.xml><?xml version="1.0" encoding="utf-8"?>
 <ct:contentTypeSchema xmlns:ct="http://schemas.microsoft.com/office/2006/metadata/contentType" xmlns:ma="http://schemas.microsoft.com/office/2006/metadata/properties/metaAttributes" ct:_="" ma:_="" ma:contentTypeName="Documento" ma:contentTypeID="0x010100E96778489EE7714D8BD12CC105EB918B" ma:contentTypeVersion="2" ma:contentTypeDescription="Crear nuevo documento." ma:contentTypeScope="" ma:versionID="416c5c7ae9b5d54d83875cd3c65194e3">
   <xsd:schema xmlns:xsd="http://www.w3.org/2001/XMLSchema" xmlns:xs="http://www.w3.org/2001/XMLSchema" xmlns:p="http://schemas.microsoft.com/office/2006/metadata/properties" xmlns:ns2="126e8a1c-9ea9-435a-ac89-d06c80d62e30" targetNamespace="http://schemas.microsoft.com/office/2006/metadata/properties" ma:root="true" ma:fieldsID="70a237c842677bd850644f8595079f5e" ns2:_="">
     <xsd:import namespace="126e8a1c-9ea9-435a-ac89-d06c80d62e30"/>
@@ -9131,26 +8968,32 @@
 </ct:contentTypeSchema>
 </file>
 
-<file path=customXml/item2.xml><?xml version="1.0" encoding="utf-8"?>
-<p:properties xmlns:p="http://schemas.microsoft.com/office/2006/metadata/properties" xmlns:xsi="http://www.w3.org/2001/XMLSchema-instance" xmlns:pc="http://schemas.microsoft.com/office/infopath/2007/PartnerControls">
-  <documentManagement/>
-</p:properties>
+<file path=customXml/itemProps1.xml><?xml version="1.0" encoding="utf-8"?>
+<ds:datastoreItem xmlns:ds="http://schemas.openxmlformats.org/officeDocument/2006/customXml" ds:itemID="{FBD61725-A60E-40F3-AB5D-0E7F797DD77D}">
+  <ds:schemaRefs>
+    <ds:schemaRef ds:uri="http://schemas.openxmlformats.org/officeDocument/2006/bibliography"/>
+  </ds:schemaRefs>
+</ds:datastoreItem>
 </file>
 
-<file path=customXml/item3.xml><?xml version="1.0" encoding="utf-8"?>
-<?mso-contentType ?>
-<FormTemplates xmlns="http://schemas.microsoft.com/sharepoint/v3/contenttype/forms">
-  <Display>DocumentLibraryForm</Display>
-  <Edit>DocumentLibraryForm</Edit>
-  <New>DocumentLibraryForm</New>
-</FormTemplates>
+<file path=customXml/itemProps2.xml><?xml version="1.0" encoding="utf-8"?>
+<ds:datastoreItem xmlns:ds="http://schemas.openxmlformats.org/officeDocument/2006/customXml" ds:itemID="{DABAA964-10BA-4DBC-ABF2-CDEAC0FAF7AA}">
+  <ds:schemaRefs>
+    <ds:schemaRef ds:uri="http://schemas.microsoft.com/sharepoint/v3/contenttype/forms"/>
+  </ds:schemaRefs>
+</ds:datastoreItem>
 </file>
 
-<file path=customXml/item4.xml><?xml version="1.0" encoding="utf-8"?>
-<b:Sources xmlns:b="http://schemas.openxmlformats.org/officeDocument/2006/bibliography" xmlns="http://schemas.openxmlformats.org/officeDocument/2006/bibliography" SelectedStyle="\APASixthEditionOfficeOnline.xsl" StyleName="APA" Version="6"/>
+<file path=customXml/itemProps3.xml><?xml version="1.0" encoding="utf-8"?>
+<ds:datastoreItem xmlns:ds="http://schemas.openxmlformats.org/officeDocument/2006/customXml" ds:itemID="{5F1783E3-BA1C-4CA3-8E32-C9B378BBED03}">
+  <ds:schemaRefs>
+    <ds:schemaRef ds:uri="http://schemas.microsoft.com/office/2006/metadata/properties"/>
+    <ds:schemaRef ds:uri="http://schemas.microsoft.com/office/infopath/2007/PartnerControls"/>
+  </ds:schemaRefs>
+</ds:datastoreItem>
 </file>
 
-<file path=customXml/itemProps1.xml><?xml version="1.0" encoding="utf-8"?>
+<file path=customXml/itemProps4.xml><?xml version="1.0" encoding="utf-8"?>
 <ds:datastoreItem xmlns:ds="http://schemas.openxmlformats.org/officeDocument/2006/customXml" ds:itemID="{DF0582E6-0C2C-40A6-8E3D-E410E41021C1}">
   <ds:schemaRefs>
     <ds:schemaRef ds:uri="http://schemas.microsoft.com/office/2006/metadata/contentType"/>
@@ -9166,36 +9009,4 @@
     <ds:schemaRef ds:uri="http://schemas.microsoft.com/internal/obd"/>
   </ds:schemaRefs>
 </ds:datastoreItem>
-</file>
-
-<file path=customXml/itemProps2.xml><?xml version="1.0" encoding="utf-8"?>
-<ds:datastoreItem xmlns:ds="http://schemas.openxmlformats.org/officeDocument/2006/customXml" ds:itemID="{5F1783E3-BA1C-4CA3-8E32-C9B378BBED03}">
-  <ds:schemaRefs>
-    <ds:schemaRef ds:uri="http://schemas.openxmlformats.org/package/2006/metadata/core-properties"/>
-    <ds:schemaRef ds:uri="http://schemas.microsoft.com/office/infopath/2007/PartnerControls"/>
-    <ds:schemaRef ds:uri="http://purl.org/dc/elements/1.1/"/>
-    <ds:schemaRef ds:uri="http://schemas.microsoft.com/office/2006/documentManagement/types"/>
-    <ds:schemaRef ds:uri="http://schemas.microsoft.com/office/2006/metadata/properties"/>
-    <ds:schemaRef ds:uri="126e8a1c-9ea9-435a-ac89-d06c80d62e30"/>
-    <ds:schemaRef ds:uri="http://purl.org/dc/terms/"/>
-    <ds:schemaRef ds:uri="http://purl.org/dc/dcmitype/"/>
-    <ds:schemaRef ds:uri="http://www.w3.org/XML/1998/namespace"/>
-  </ds:schemaRefs>
-</ds:datastoreItem>
-</file>
-
-<file path=customXml/itemProps3.xml><?xml version="1.0" encoding="utf-8"?>
-<ds:datastoreItem xmlns:ds="http://schemas.openxmlformats.org/officeDocument/2006/customXml" ds:itemID="{DABAA964-10BA-4DBC-ABF2-CDEAC0FAF7AA}">
-  <ds:schemaRefs>
-    <ds:schemaRef ds:uri="http://schemas.microsoft.com/sharepoint/v3/contenttype/forms"/>
-  </ds:schemaRefs>
-</ds:datastoreItem>
-</file>
-
-<file path=customXml/itemProps4.xml><?xml version="1.0" encoding="utf-8"?>
-<ds:datastoreItem xmlns:ds="http://schemas.openxmlformats.org/officeDocument/2006/customXml" ds:itemID="{FBD61725-A60E-40F3-AB5D-0E7F797DD77D}">
-  <ds:schemaRefs>
-    <ds:schemaRef ds:uri="http://schemas.openxmlformats.org/officeDocument/2006/bibliography"/>
-  </ds:schemaRefs>
-</ds:datastoreItem>
 </file>
</xml_diff>